<commit_message>
Domus Energia (negócio): "Como funciona um pedido" no plano (secção 8) e na apresentação (diapositivo 9, ficheiro _v2)
Co-Authored-By: Claude Opus 5.5 <noreply@anthropic.com>
</commit_message>
<xml_diff>
--- a/domus-energia/negocio/Plano_de_Negocio_Domus_Energia.docx
+++ b/domus-energia/negocio/Plano_de_Negocio_Domus_Energia.docx
@@ -526,7 +526,7 @@
           </w:pPr>
           <w:hyperlink w:history="1" w:anchor="_Toc17">
             <w:r>
-              <w:t xml:space="preserve">Fase de preparação (outubro de 2026 a agosto de 2027)</w:t>
+              <w:t xml:space="preserve">Como funciona um pedido</w:t>
             </w:r>
             <w:r>
               <w:tab/>
@@ -534,28 +534,6 @@
             <w:r>
               <w:fldChar w:fldCharType="begin" w:dirty="true"/>
               <w:instrText xml:space="preserve">PAGEREF _Toc17 \h</w:instrText>
-              <w:fldChar w:fldCharType="separate"/>
-              <w:fldChar w:fldCharType="end"/>
-            </w:r>
-          </w:hyperlink>
-        </w:p>
-        <w:p>
-          <w:pPr>
-            <w:pStyle w:val="TOC1"/>
-            <w:tabs>
-              <w:tab w:val="right" w:pos="9026" w:leader="dot"/>
-            </w:tabs>
-          </w:pPr>
-          <w:hyperlink w:history="1" w:anchor="_Toc18">
-            <w:r>
-              <w:t xml:space="preserve">9. Recursos humanos e recursos da empresa</w:t>
-            </w:r>
-            <w:r>
-              <w:tab/>
-            </w:r>
-            <w:r>
-              <w:fldChar w:fldCharType="begin" w:dirty="true"/>
-              <w:instrText xml:space="preserve">PAGEREF _Toc18 \h</w:instrText>
               <w:fldChar w:fldCharType="separate"/>
               <w:fldChar w:fldCharType="end"/>
             </w:r>
@@ -569,9 +547,31 @@
             </w:tabs>
             <w:ind w:left="220"/>
           </w:pPr>
+          <w:hyperlink w:history="1" w:anchor="_Toc18">
+            <w:r>
+              <w:t xml:space="preserve">Fase de preparação (outubro de 2026 a agosto de 2027)</w:t>
+            </w:r>
+            <w:r>
+              <w:tab/>
+            </w:r>
+            <w:r>
+              <w:fldChar w:fldCharType="begin" w:dirty="true"/>
+              <w:instrText xml:space="preserve">PAGEREF _Toc18 \h</w:instrText>
+              <w:fldChar w:fldCharType="separate"/>
+              <w:fldChar w:fldCharType="end"/>
+            </w:r>
+          </w:hyperlink>
+        </w:p>
+        <w:p>
+          <w:pPr>
+            <w:pStyle w:val="TOC1"/>
+            <w:tabs>
+              <w:tab w:val="right" w:pos="9026" w:leader="dot"/>
+            </w:tabs>
+          </w:pPr>
           <w:hyperlink w:history="1" w:anchor="_Toc19">
             <w:r>
-              <w:t xml:space="preserve">Organização proposta</w:t>
+              <w:t xml:space="preserve">9. Recursos humanos e recursos da empresa</w:t>
             </w:r>
             <w:r>
               <w:tab/>
@@ -594,7 +594,7 @@
           </w:pPr>
           <w:hyperlink w:history="1" w:anchor="_Toc20">
             <w:r>
-              <w:t xml:space="preserve">Regras de funcionamento</w:t>
+              <w:t xml:space="preserve">Organização proposta</w:t>
             </w:r>
             <w:r>
               <w:tab/>
@@ -617,7 +617,7 @@
           </w:pPr>
           <w:hyperlink w:history="1" w:anchor="_Toc21">
             <w:r>
-              <w:t xml:space="preserve">Carga de trabalho prevista no ano 1</w:t>
+              <w:t xml:space="preserve">Regras de funcionamento</w:t>
             </w:r>
             <w:r>
               <w:tab/>
@@ -640,7 +640,7 @@
           </w:pPr>
           <w:hyperlink w:history="1" w:anchor="_Toc22">
             <w:r>
-              <w:t xml:space="preserve">De parceiro a contrato</w:t>
+              <w:t xml:space="preserve">Carga de trabalho prevista no ano 1</w:t>
             </w:r>
             <w:r>
               <w:tab/>
@@ -663,7 +663,7 @@
           </w:pPr>
           <w:hyperlink w:history="1" w:anchor="_Toc23">
             <w:r>
-              <w:t xml:space="preserve">Quando o gerente deixa de chegar</w:t>
+              <w:t xml:space="preserve">De parceiro a contrato</w:t>
             </w:r>
             <w:r>
               <w:tab/>
@@ -678,14 +678,15 @@
         </w:p>
         <w:p>
           <w:pPr>
-            <w:pStyle w:val="TOC1"/>
+            <w:pStyle w:val="TOC2"/>
             <w:tabs>
               <w:tab w:val="right" w:pos="9026" w:leader="dot"/>
             </w:tabs>
+            <w:ind w:left="220"/>
           </w:pPr>
           <w:hyperlink w:history="1" w:anchor="_Toc24">
             <w:r>
-              <w:t xml:space="preserve">10. Investimento necessário</w:t>
+              <w:t xml:space="preserve">Quando o gerente deixa de chegar</w:t>
             </w:r>
             <w:r>
               <w:tab/>
@@ -707,7 +708,7 @@
           </w:pPr>
           <w:hyperlink w:history="1" w:anchor="_Toc25">
             <w:r>
-              <w:t xml:space="preserve">11. Custos e previsões financeiras</w:t>
+              <w:t xml:space="preserve">10. Investimento necessário</w:t>
             </w:r>
             <w:r>
               <w:tab/>
@@ -722,15 +723,14 @@
         </w:p>
         <w:p>
           <w:pPr>
-            <w:pStyle w:val="TOC2"/>
+            <w:pStyle w:val="TOC1"/>
             <w:tabs>
               <w:tab w:val="right" w:pos="9026" w:leader="dot"/>
             </w:tabs>
-            <w:ind w:left="220"/>
           </w:pPr>
           <w:hyperlink w:history="1" w:anchor="_Toc26">
             <w:r>
-              <w:t xml:space="preserve">Custo e despesa</w:t>
+              <w:t xml:space="preserve">11. Custos e previsões financeiras</w:t>
             </w:r>
             <w:r>
               <w:tab/>
@@ -753,7 +753,7 @@
           </w:pPr>
           <w:hyperlink w:history="1" w:anchor="_Toc27">
             <w:r>
-              <w:t xml:space="preserve">Classificação dos custos da Domus Energia</w:t>
+              <w:t xml:space="preserve">Custo e despesa</w:t>
             </w:r>
             <w:r>
               <w:tab/>
@@ -776,7 +776,7 @@
           </w:pPr>
           <w:hyperlink w:history="1" w:anchor="_Toc28">
             <w:r>
-              <w:t xml:space="preserve">Custo estimado de uma obra (Casa inteligente (T3), 685 € sem IVA)</w:t>
+              <w:t xml:space="preserve">Classificação dos custos da Domus Energia</w:t>
             </w:r>
             <w:r>
               <w:tab/>
@@ -799,7 +799,7 @@
           </w:pPr>
           <w:hyperlink w:history="1" w:anchor="_Toc29">
             <w:r>
-              <w:t xml:space="preserve">Margem por tipo de obra</w:t>
+              <w:t xml:space="preserve">Custo estimado de uma obra (Casa inteligente (T3), 685 € sem IVA)</w:t>
             </w:r>
             <w:r>
               <w:tab/>
@@ -822,7 +822,7 @@
           </w:pPr>
           <w:hyperlink w:history="1" w:anchor="_Toc30">
             <w:r>
-              <w:t xml:space="preserve">Ponto de equilíbrio</w:t>
+              <w:t xml:space="preserve">Margem por tipo de obra</w:t>
             </w:r>
             <w:r>
               <w:tab/>
@@ -845,7 +845,7 @@
           </w:pPr>
           <w:hyperlink w:history="1" w:anchor="_Toc31">
             <w:r>
-              <w:t xml:space="preserve">Pressupostos</w:t>
+              <w:t xml:space="preserve">Ponto de equilíbrio</w:t>
             </w:r>
             <w:r>
               <w:tab/>
@@ -868,7 +868,7 @@
           </w:pPr>
           <w:hyperlink w:history="1" w:anchor="_Toc32">
             <w:r>
-              <w:t xml:space="preserve">Custos fixos mensais</w:t>
+              <w:t xml:space="preserve">Pressupostos</w:t>
             </w:r>
             <w:r>
               <w:tab/>
@@ -891,7 +891,7 @@
           </w:pPr>
           <w:hyperlink w:history="1" w:anchor="_Toc33">
             <w:r>
-              <w:t xml:space="preserve">Previsão mensal</w:t>
+              <w:t xml:space="preserve">Custos fixos mensais</w:t>
             </w:r>
             <w:r>
               <w:tab/>
@@ -899,28 +899,6 @@
             <w:r>
               <w:fldChar w:fldCharType="begin" w:dirty="true"/>
               <w:instrText xml:space="preserve">PAGEREF _Toc33 \h</w:instrText>
-              <w:fldChar w:fldCharType="separate"/>
-              <w:fldChar w:fldCharType="end"/>
-            </w:r>
-          </w:hyperlink>
-        </w:p>
-        <w:p>
-          <w:pPr>
-            <w:pStyle w:val="TOC1"/>
-            <w:tabs>
-              <w:tab w:val="right" w:pos="9026" w:leader="dot"/>
-            </w:tabs>
-          </w:pPr>
-          <w:hyperlink w:history="1" w:anchor="_Toc34">
-            <w:r>
-              <w:t xml:space="preserve">12. Riscos e medidas de prevenção</w:t>
-            </w:r>
-            <w:r>
-              <w:tab/>
-            </w:r>
-            <w:r>
-              <w:fldChar w:fldCharType="begin" w:dirty="true"/>
-              <w:instrText xml:space="preserve">PAGEREF _Toc34 \h</w:instrText>
               <w:fldChar w:fldCharType="separate"/>
               <w:fldChar w:fldCharType="end"/>
             </w:r>
@@ -934,16 +912,16 @@
             </w:tabs>
             <w:ind w:left="220"/>
           </w:pPr>
-          <w:hyperlink w:history="1" w:anchor="_Toc35">
-            <w:r>
-              <w:t xml:space="preserve">Apoios a considerar</w:t>
+          <w:hyperlink w:history="1" w:anchor="_Toc34">
+            <w:r>
+              <w:t xml:space="preserve">Previsão mensal</w:t>
             </w:r>
             <w:r>
               <w:tab/>
             </w:r>
             <w:r>
               <w:fldChar w:fldCharType="begin" w:dirty="true"/>
-              <w:instrText xml:space="preserve">PAGEREF _Toc35 \h</w:instrText>
+              <w:instrText xml:space="preserve">PAGEREF _Toc34 \h</w:instrText>
               <w:fldChar w:fldCharType="separate"/>
               <w:fldChar w:fldCharType="end"/>
             </w:r>
@@ -956,9 +934,32 @@
               <w:tab w:val="right" w:pos="9026" w:leader="dot"/>
             </w:tabs>
           </w:pPr>
+          <w:hyperlink w:history="1" w:anchor="_Toc35">
+            <w:r>
+              <w:t xml:space="preserve">12. Riscos e medidas de prevenção</w:t>
+            </w:r>
+            <w:r>
+              <w:tab/>
+            </w:r>
+            <w:r>
+              <w:fldChar w:fldCharType="begin" w:dirty="true"/>
+              <w:instrText xml:space="preserve">PAGEREF _Toc35 \h</w:instrText>
+              <w:fldChar w:fldCharType="separate"/>
+              <w:fldChar w:fldCharType="end"/>
+            </w:r>
+          </w:hyperlink>
+        </w:p>
+        <w:p>
+          <w:pPr>
+            <w:pStyle w:val="TOC2"/>
+            <w:tabs>
+              <w:tab w:val="right" w:pos="9026" w:leader="dot"/>
+            </w:tabs>
+            <w:ind w:left="220"/>
+          </w:pPr>
           <w:hyperlink w:history="1" w:anchor="_Toc36">
             <w:r>
-              <w:t xml:space="preserve">13. Objetivos e resultados esperados</w:t>
+              <w:t xml:space="preserve">Apoios a considerar</w:t>
             </w:r>
             <w:r>
               <w:tab/>
@@ -980,7 +981,7 @@
           </w:pPr>
           <w:hyperlink w:history="1" w:anchor="_Toc37">
             <w:r>
-              <w:t xml:space="preserve">14. O plano como instrumento de decisão</w:t>
+              <w:t xml:space="preserve">13. Objetivos e resultados esperados</w:t>
             </w:r>
             <w:r>
               <w:tab/>
@@ -1002,7 +1003,7 @@
           </w:pPr>
           <w:hyperlink w:history="1" w:anchor="_Toc38">
             <w:r>
-              <w:t xml:space="preserve">15. Plano de ação</w:t>
+              <w:t xml:space="preserve">14. O plano como instrumento de decisão</w:t>
             </w:r>
             <w:r>
               <w:tab/>
@@ -1017,15 +1018,14 @@
         </w:p>
         <w:p>
           <w:pPr>
-            <w:pStyle w:val="TOC2"/>
+            <w:pStyle w:val="TOC1"/>
             <w:tabs>
               <w:tab w:val="right" w:pos="9026" w:leader="dot"/>
             </w:tabs>
-            <w:ind w:left="220"/>
           </w:pPr>
           <w:hyperlink w:history="1" w:anchor="_Toc39">
             <w:r>
-              <w:t xml:space="preserve">Preparação (outubro de 2026 a agosto de 2027)</w:t>
+              <w:t xml:space="preserve">15. Plano de ação</w:t>
             </w:r>
             <w:r>
               <w:tab/>
@@ -1048,7 +1048,7 @@
           </w:pPr>
           <w:hyperlink w:history="1" w:anchor="_Toc40">
             <w:r>
-              <w:t xml:space="preserve">Arranque (setembro a novembro de 2027)</w:t>
+              <w:t xml:space="preserve">Preparação (outubro de 2026 a agosto de 2027)</w:t>
             </w:r>
             <w:r>
               <w:tab/>
@@ -1056,28 +1056,6 @@
             <w:r>
               <w:fldChar w:fldCharType="begin" w:dirty="true"/>
               <w:instrText xml:space="preserve">PAGEREF _Toc40 \h</w:instrText>
-              <w:fldChar w:fldCharType="separate"/>
-              <w:fldChar w:fldCharType="end"/>
-            </w:r>
-          </w:hyperlink>
-        </w:p>
-        <w:p>
-          <w:pPr>
-            <w:pStyle w:val="TOC1"/>
-            <w:tabs>
-              <w:tab w:val="right" w:pos="9026" w:leader="dot"/>
-            </w:tabs>
-          </w:pPr>
-          <w:hyperlink w:history="1" w:anchor="_Toc41">
-            <w:r>
-              <w:t xml:space="preserve">III.1 Planeamento e organização do trabalho</w:t>
-            </w:r>
-            <w:r>
-              <w:tab/>
-            </w:r>
-            <w:r>
-              <w:fldChar w:fldCharType="begin" w:dirty="true"/>
-              <w:instrText xml:space="preserve">PAGEREF _Toc41 \h</w:instrText>
               <w:fldChar w:fldCharType="separate"/>
               <w:fldChar w:fldCharType="end"/>
             </w:r>
@@ -1091,9 +1069,31 @@
             </w:tabs>
             <w:ind w:left="220"/>
           </w:pPr>
+          <w:hyperlink w:history="1" w:anchor="_Toc41">
+            <w:r>
+              <w:t xml:space="preserve">Arranque (setembro a novembro de 2027)</w:t>
+            </w:r>
+            <w:r>
+              <w:tab/>
+            </w:r>
+            <w:r>
+              <w:fldChar w:fldCharType="begin" w:dirty="true"/>
+              <w:instrText xml:space="preserve">PAGEREF _Toc41 \h</w:instrText>
+              <w:fldChar w:fldCharType="separate"/>
+              <w:fldChar w:fldCharType="end"/>
+            </w:r>
+          </w:hyperlink>
+        </w:p>
+        <w:p>
+          <w:pPr>
+            <w:pStyle w:val="TOC1"/>
+            <w:tabs>
+              <w:tab w:val="right" w:pos="9026" w:leader="dot"/>
+            </w:tabs>
+          </w:pPr>
           <w:hyperlink w:history="1" w:anchor="_Toc42">
             <w:r>
-              <w:t xml:space="preserve">Semana tipo do gerente</w:t>
+              <w:t xml:space="preserve">III.1 Planeamento e organização do trabalho</w:t>
             </w:r>
             <w:r>
               <w:tab/>
@@ -1116,7 +1116,7 @@
           </w:pPr>
           <w:hyperlink w:history="1" w:anchor="_Toc43">
             <w:r>
-              <w:t xml:space="preserve">Uma pessoa organizada, aplicado à empresa</w:t>
+              <w:t xml:space="preserve">Semana tipo do gerente</w:t>
             </w:r>
             <w:r>
               <w:tab/>
@@ -1139,7 +1139,7 @@
           </w:pPr>
           <w:hyperlink w:history="1" w:anchor="_Toc44">
             <w:r>
-              <w:t xml:space="preserve">Ferramentas de organização</w:t>
+              <w:t xml:space="preserve">Uma pessoa organizada, aplicado à empresa</w:t>
             </w:r>
             <w:r>
               <w:tab/>
@@ -1147,28 +1147,6 @@
             <w:r>
               <w:fldChar w:fldCharType="begin" w:dirty="true"/>
               <w:instrText xml:space="preserve">PAGEREF _Toc44 \h</w:instrText>
-              <w:fldChar w:fldCharType="separate"/>
-              <w:fldChar w:fldCharType="end"/>
-            </w:r>
-          </w:hyperlink>
-        </w:p>
-        <w:p>
-          <w:pPr>
-            <w:pStyle w:val="TOC1"/>
-            <w:tabs>
-              <w:tab w:val="right" w:pos="9026" w:leader="dot"/>
-            </w:tabs>
-          </w:pPr>
-          <w:hyperlink w:history="1" w:anchor="_Toc45">
-            <w:r>
-              <w:t xml:space="preserve">III.2 Gestão do tempo</w:t>
-            </w:r>
-            <w:r>
-              <w:tab/>
-            </w:r>
-            <w:r>
-              <w:fldChar w:fldCharType="begin" w:dirty="true"/>
-              <w:instrText xml:space="preserve">PAGEREF _Toc45 \h</w:instrText>
               <w:fldChar w:fldCharType="separate"/>
               <w:fldChar w:fldCharType="end"/>
             </w:r>
@@ -1182,16 +1160,16 @@
             </w:tabs>
             <w:ind w:left="220"/>
           </w:pPr>
-          <w:hyperlink w:history="1" w:anchor="_Toc46">
-            <w:r>
-              <w:t xml:space="preserve">Revisão semanal (sexta-feira, 20 minutos)</w:t>
+          <w:hyperlink w:history="1" w:anchor="_Toc45">
+            <w:r>
+              <w:t xml:space="preserve">Ferramentas de organização</w:t>
             </w:r>
             <w:r>
               <w:tab/>
             </w:r>
             <w:r>
               <w:fldChar w:fldCharType="begin" w:dirty="true"/>
-              <w:instrText xml:space="preserve">PAGEREF _Toc46 \h</w:instrText>
+              <w:instrText xml:space="preserve">PAGEREF _Toc45 \h</w:instrText>
               <w:fldChar w:fldCharType="separate"/>
               <w:fldChar w:fldCharType="end"/>
             </w:r>
@@ -1204,9 +1182,32 @@
               <w:tab w:val="right" w:pos="9026" w:leader="dot"/>
             </w:tabs>
           </w:pPr>
+          <w:hyperlink w:history="1" w:anchor="_Toc46">
+            <w:r>
+              <w:t xml:space="preserve">III.2 Gestão do tempo</w:t>
+            </w:r>
+            <w:r>
+              <w:tab/>
+            </w:r>
+            <w:r>
+              <w:fldChar w:fldCharType="begin" w:dirty="true"/>
+              <w:instrText xml:space="preserve">PAGEREF _Toc46 \h</w:instrText>
+              <w:fldChar w:fldCharType="separate"/>
+              <w:fldChar w:fldCharType="end"/>
+            </w:r>
+          </w:hyperlink>
+        </w:p>
+        <w:p>
+          <w:pPr>
+            <w:pStyle w:val="TOC2"/>
+            <w:tabs>
+              <w:tab w:val="right" w:pos="9026" w:leader="dot"/>
+            </w:tabs>
+            <w:ind w:left="220"/>
+          </w:pPr>
           <w:hyperlink w:history="1" w:anchor="_Toc47">
             <w:r>
-              <w:t xml:space="preserve">III.3 Definição de prioridades</w:t>
+              <w:t xml:space="preserve">Revisão semanal (sexta-feira, 20 minutos)</w:t>
             </w:r>
             <w:r>
               <w:tab/>
@@ -1228,7 +1229,7 @@
           </w:pPr>
           <w:hyperlink w:history="1" w:anchor="_Toc48">
             <w:r>
-              <w:t xml:space="preserve">III.4 Planeamento de tarefas</w:t>
+              <w:t xml:space="preserve">III.3 Definição de prioridades</w:t>
             </w:r>
             <w:r>
               <w:tab/>
@@ -1243,15 +1244,14 @@
         </w:p>
         <w:p>
           <w:pPr>
-            <w:pStyle w:val="TOC2"/>
+            <w:pStyle w:val="TOC1"/>
             <w:tabs>
               <w:tab w:val="right" w:pos="9026" w:leader="dot"/>
             </w:tabs>
-            <w:ind w:left="220"/>
           </w:pPr>
           <w:hyperlink w:history="1" w:anchor="_Toc49">
             <w:r>
-              <w:t xml:space="preserve">Funções do planeamento na empresa</w:t>
+              <w:t xml:space="preserve">III.4 Planeamento de tarefas</w:t>
             </w:r>
             <w:r>
               <w:tab/>
@@ -1274,7 +1274,7 @@
           </w:pPr>
           <w:hyperlink w:history="1" w:anchor="_Toc50">
             <w:r>
-              <w:t xml:space="preserve">Exemplo do módulo: preparar a reunião semanal</w:t>
+              <w:t xml:space="preserve">Funções do planeamento na empresa</w:t>
             </w:r>
             <w:r>
               <w:tab/>
@@ -1297,7 +1297,7 @@
           </w:pPr>
           <w:hyperlink w:history="1" w:anchor="_Toc51">
             <w:r>
-              <w:t xml:space="preserve">Sequência de uma obra</w:t>
+              <w:t xml:space="preserve">Exemplo do módulo: preparar a reunião semanal</w:t>
             </w:r>
             <w:r>
               <w:tab/>
@@ -1305,28 +1305,6 @@
             <w:r>
               <w:fldChar w:fldCharType="begin" w:dirty="true"/>
               <w:instrText xml:space="preserve">PAGEREF _Toc51 \h</w:instrText>
-              <w:fldChar w:fldCharType="separate"/>
-              <w:fldChar w:fldCharType="end"/>
-            </w:r>
-          </w:hyperlink>
-        </w:p>
-        <w:p>
-          <w:pPr>
-            <w:pStyle w:val="TOC1"/>
-            <w:tabs>
-              <w:tab w:val="right" w:pos="9026" w:leader="dot"/>
-            </w:tabs>
-          </w:pPr>
-          <w:hyperlink w:history="1" w:anchor="_Toc52">
-            <w:r>
-              <w:t xml:space="preserve">III.5 Objetivos e resultados (SMART)</w:t>
-            </w:r>
-            <w:r>
-              <w:tab/>
-            </w:r>
-            <w:r>
-              <w:fldChar w:fldCharType="begin" w:dirty="true"/>
-              <w:instrText xml:space="preserve">PAGEREF _Toc52 \h</w:instrText>
               <w:fldChar w:fldCharType="separate"/>
               <w:fldChar w:fldCharType="end"/>
             </w:r>
@@ -1340,16 +1318,16 @@
             </w:tabs>
             <w:ind w:left="220"/>
           </w:pPr>
-          <w:hyperlink w:history="1" w:anchor="_Toc53">
-            <w:r>
-              <w:t xml:space="preserve">Exercício do módulo: de objetivo vago a SMART</w:t>
+          <w:hyperlink w:history="1" w:anchor="_Toc52">
+            <w:r>
+              <w:t xml:space="preserve">Sequência de uma obra</w:t>
             </w:r>
             <w:r>
               <w:tab/>
             </w:r>
             <w:r>
               <w:fldChar w:fldCharType="begin" w:dirty="true"/>
-              <w:instrText xml:space="preserve">PAGEREF _Toc53 \h</w:instrText>
+              <w:instrText xml:space="preserve">PAGEREF _Toc52 \h</w:instrText>
               <w:fldChar w:fldCharType="separate"/>
               <w:fldChar w:fldCharType="end"/>
             </w:r>
@@ -1362,9 +1340,32 @@
               <w:tab w:val="right" w:pos="9026" w:leader="dot"/>
             </w:tabs>
           </w:pPr>
+          <w:hyperlink w:history="1" w:anchor="_Toc53">
+            <w:r>
+              <w:t xml:space="preserve">III.5 Objetivos e resultados (SMART)</w:t>
+            </w:r>
+            <w:r>
+              <w:tab/>
+            </w:r>
+            <w:r>
+              <w:fldChar w:fldCharType="begin" w:dirty="true"/>
+              <w:instrText xml:space="preserve">PAGEREF _Toc53 \h</w:instrText>
+              <w:fldChar w:fldCharType="separate"/>
+              <w:fldChar w:fldCharType="end"/>
+            </w:r>
+          </w:hyperlink>
+        </w:p>
+        <w:p>
+          <w:pPr>
+            <w:pStyle w:val="TOC2"/>
+            <w:tabs>
+              <w:tab w:val="right" w:pos="9026" w:leader="dot"/>
+            </w:tabs>
+            <w:ind w:left="220"/>
+          </w:pPr>
           <w:hyperlink w:history="1" w:anchor="_Toc54">
             <w:r>
-              <w:t xml:space="preserve">III.6 Trabalho e orientação para resultados</w:t>
+              <w:t xml:space="preserve">Exercício do módulo: de objetivo vago a SMART</w:t>
             </w:r>
             <w:r>
               <w:tab/>
@@ -1386,7 +1387,7 @@
           </w:pPr>
           <w:hyperlink w:history="1" w:anchor="_Toc55">
             <w:r>
-              <w:t xml:space="preserve">III.7 Proatividade</w:t>
+              <w:t xml:space="preserve">III.6 Trabalho e orientação para resultados</w:t>
             </w:r>
             <w:r>
               <w:tab/>
@@ -1408,7 +1409,7 @@
           </w:pPr>
           <w:hyperlink w:history="1" w:anchor="_Toc56">
             <w:r>
-              <w:t xml:space="preserve">III.8 Capacidade de decisão</w:t>
+              <w:t xml:space="preserve">III.7 Proatividade</w:t>
             </w:r>
             <w:r>
               <w:tab/>
@@ -1416,6 +1417,28 @@
             <w:r>
               <w:fldChar w:fldCharType="begin" w:dirty="true"/>
               <w:instrText xml:space="preserve">PAGEREF _Toc56 \h</w:instrText>
+              <w:fldChar w:fldCharType="separate"/>
+              <w:fldChar w:fldCharType="end"/>
+            </w:r>
+          </w:hyperlink>
+        </w:p>
+        <w:p>
+          <w:pPr>
+            <w:pStyle w:val="TOC1"/>
+            <w:tabs>
+              <w:tab w:val="right" w:pos="9026" w:leader="dot"/>
+            </w:tabs>
+          </w:pPr>
+          <w:hyperlink w:history="1" w:anchor="_Toc57">
+            <w:r>
+              <w:t xml:space="preserve">III.8 Capacidade de decisão</w:t>
+            </w:r>
+            <w:r>
+              <w:tab/>
+            </w:r>
+            <w:r>
+              <w:fldChar w:fldCharType="begin" w:dirty="true"/>
+              <w:instrText xml:space="preserve">PAGEREF _Toc57 \h</w:instrText>
               <w:fldChar w:fldCharType="separate"/>
               <w:fldChar w:fldCharType="end"/>
             </w:r>
@@ -1429,31 +1452,9 @@
             </w:tabs>
             <w:ind w:left="220"/>
           </w:pPr>
-          <w:hyperlink w:history="1" w:anchor="_Toc57">
+          <w:hyperlink w:history="1" w:anchor="_Toc58">
             <w:r>
               <w:t xml:space="preserve">Da decisão à ação (passo 6) e avaliação (passo 7)</w:t>
-            </w:r>
-            <w:r>
-              <w:tab/>
-            </w:r>
-            <w:r>
-              <w:fldChar w:fldCharType="begin" w:dirty="true"/>
-              <w:instrText xml:space="preserve">PAGEREF _Toc57 \h</w:instrText>
-              <w:fldChar w:fldCharType="separate"/>
-              <w:fldChar w:fldCharType="end"/>
-            </w:r>
-          </w:hyperlink>
-        </w:p>
-        <w:p>
-          <w:pPr>
-            <w:pStyle w:val="TOC1"/>
-            <w:tabs>
-              <w:tab w:val="right" w:pos="9026" w:leader="dot"/>
-            </w:tabs>
-          </w:pPr>
-          <w:hyperlink w:history="1" w:anchor="_Toc58">
-            <w:r>
-              <w:t xml:space="preserve">Próximos passos (próximos 90 dias)</w:t>
             </w:r>
             <w:r>
               <w:tab/>
@@ -1475,7 +1476,7 @@
           </w:pPr>
           <w:hyperlink w:history="1" w:anchor="_Toc59">
             <w:r>
-              <w:t xml:space="preserve">Anexo A: Atividade de grupo, ideia de negócio</w:t>
+              <w:t xml:space="preserve">Próximos passos (próximos 90 dias)</w:t>
             </w:r>
             <w:r>
               <w:tab/>
@@ -1497,7 +1498,7 @@
           </w:pPr>
           <w:hyperlink w:history="1" w:anchor="_Toc60">
             <w:r>
-              <w:t xml:space="preserve">Anexo B: Correspondência com o módulo 7855</w:t>
+              <w:t xml:space="preserve">Anexo A: Atividade de grupo, ideia de negócio</w:t>
             </w:r>
             <w:r>
               <w:tab/>
@@ -1505,6 +1506,28 @@
             <w:r>
               <w:fldChar w:fldCharType="begin" w:dirty="true"/>
               <w:instrText xml:space="preserve">PAGEREF _Toc60 \h</w:instrText>
+              <w:fldChar w:fldCharType="separate"/>
+              <w:fldChar w:fldCharType="end"/>
+            </w:r>
+          </w:hyperlink>
+        </w:p>
+        <w:p>
+          <w:pPr>
+            <w:pStyle w:val="TOC1"/>
+            <w:tabs>
+              <w:tab w:val="right" w:pos="9026" w:leader="dot"/>
+            </w:tabs>
+          </w:pPr>
+          <w:hyperlink w:history="1" w:anchor="_Toc61">
+            <w:r>
+              <w:t xml:space="preserve">Anexo B: Correspondência com o módulo 7855</w:t>
+            </w:r>
+            <w:r>
+              <w:tab/>
+            </w:r>
+            <w:r>
+              <w:fldChar w:fldCharType="begin" w:dirty="true"/>
+              <w:instrText xml:space="preserve">PAGEREF _Toc61 \h</w:instrText>
               <w:fldChar w:fldCharType="separate"/>
               <w:fldChar w:fldCharType="end"/>
             </w:r>
@@ -7569,9 +7592,906 @@
       </w:pPr>
       <w:bookmarkStart w:name="_Toc17" w:id="17"/>
       <w:r>
+        <w:t xml:space="preserve">Como funciona um pedido</w:t>
+      </w:r>
+      <w:bookmarkEnd w:id="17"/>
+    </w:p>
+    <w:p>
+      <w:pPr>
+        <w:spacing w:after="120"/>
+      </w:pPr>
+      <w:r>
+        <w:t xml:space="preserve">Cada pedido segue sempre os mesmos oito passos, do site até ao pagamento do eletricista. O CEO é o gerente da empresa.</w:t>
+      </w:r>
+    </w:p>
+    <w:tbl>
+      <w:tblPr>
+        <w:tblW w:type="dxa" w:w="9026"/>
+        <w:tblBorders>
+          <w:top w:val="single" w:color="auto" w:sz="4"/>
+          <w:left w:val="single" w:color="auto" w:sz="4"/>
+          <w:bottom w:val="single" w:color="auto" w:sz="4"/>
+          <w:right w:val="single" w:color="auto" w:sz="4"/>
+          <w:insideH w:val="single" w:color="auto" w:sz="4"/>
+          <w:insideV w:val="single" w:color="auto" w:sz="4"/>
+        </w:tblBorders>
+      </w:tblPr>
+      <w:tblGrid>
+        <w:gridCol w:w="802"/>
+        <w:gridCol w:w="2206"/>
+        <w:gridCol w:w="6018"/>
+      </w:tblGrid>
+      <w:tr>
+        <w:trPr>
+          <w:tblHeader/>
+        </w:trPr>
+        <w:tc>
+          <w:tcPr>
+            <w:tcW w:type="dxa" w:w="802"/>
+            <w:tcBorders>
+              <w:top w:val="single" w:color="D9D3B0" w:sz="4"/>
+              <w:left w:val="single" w:color="D9D3B0" w:sz="4"/>
+              <w:bottom w:val="single" w:color="D9D3B0" w:sz="4"/>
+              <w:right w:val="single" w:color="D9D3B0" w:sz="4"/>
+            </w:tcBorders>
+            <w:shd w:fill="606C38" w:color="auto" w:val="clear"/>
+            <w:tcMar>
+              <w:top w:type="dxa" w:w="60"/>
+              <w:left w:type="dxa" w:w="100"/>
+              <w:bottom w:type="dxa" w:w="60"/>
+              <w:right w:type="dxa" w:w="100"/>
+            </w:tcMar>
+          </w:tcPr>
+          <w:p>
+            <w:pPr>
+              <w:jc w:val="left"/>
+            </w:pPr>
+            <w:r>
+              <w:rPr>
+                <w:b/>
+                <w:bCs/>
+                <w:color w:val="FEFAE0"/>
+                <w:sz w:val="19"/>
+                <w:szCs w:val="19"/>
+              </w:rPr>
+              <w:t xml:space="preserve">Passo</w:t>
+            </w:r>
+          </w:p>
+        </w:tc>
+        <w:tc>
+          <w:tcPr>
+            <w:tcW w:type="dxa" w:w="2206"/>
+            <w:tcBorders>
+              <w:top w:val="single" w:color="D9D3B0" w:sz="4"/>
+              <w:left w:val="single" w:color="D9D3B0" w:sz="4"/>
+              <w:bottom w:val="single" w:color="D9D3B0" w:sz="4"/>
+              <w:right w:val="single" w:color="D9D3B0" w:sz="4"/>
+            </w:tcBorders>
+            <w:shd w:fill="606C38" w:color="auto" w:val="clear"/>
+            <w:tcMar>
+              <w:top w:type="dxa" w:w="60"/>
+              <w:left w:type="dxa" w:w="100"/>
+              <w:bottom w:type="dxa" w:w="60"/>
+              <w:right w:type="dxa" w:w="100"/>
+            </w:tcMar>
+          </w:tcPr>
+          <w:p>
+            <w:pPr>
+              <w:jc w:val="left"/>
+            </w:pPr>
+            <w:r>
+              <w:rPr>
+                <w:b/>
+                <w:bCs/>
+                <w:color w:val="FEFAE0"/>
+                <w:sz w:val="19"/>
+                <w:szCs w:val="19"/>
+              </w:rPr>
+              <w:t xml:space="preserve">Quem</w:t>
+            </w:r>
+          </w:p>
+        </w:tc>
+        <w:tc>
+          <w:tcPr>
+            <w:tcW w:type="dxa" w:w="6018"/>
+            <w:tcBorders>
+              <w:top w:val="single" w:color="D9D3B0" w:sz="4"/>
+              <w:left w:val="single" w:color="D9D3B0" w:sz="4"/>
+              <w:bottom w:val="single" w:color="D9D3B0" w:sz="4"/>
+              <w:right w:val="single" w:color="D9D3B0" w:sz="4"/>
+            </w:tcBorders>
+            <w:shd w:fill="606C38" w:color="auto" w:val="clear"/>
+            <w:tcMar>
+              <w:top w:type="dxa" w:w="60"/>
+              <w:left w:type="dxa" w:w="100"/>
+              <w:bottom w:type="dxa" w:w="60"/>
+              <w:right w:type="dxa" w:w="100"/>
+            </w:tcMar>
+          </w:tcPr>
+          <w:p>
+            <w:pPr>
+              <w:jc w:val="left"/>
+            </w:pPr>
+            <w:r>
+              <w:rPr>
+                <w:b/>
+                <w:bCs/>
+                <w:color w:val="FEFAE0"/>
+                <w:sz w:val="19"/>
+                <w:szCs w:val="19"/>
+              </w:rPr>
+              <w:t xml:space="preserve">O que acontece</w:t>
+            </w:r>
+          </w:p>
+        </w:tc>
+      </w:tr>
+      <w:tr>
+        <w:tc>
+          <w:tcPr>
+            <w:tcW w:type="dxa" w:w="802"/>
+            <w:tcBorders>
+              <w:top w:val="single" w:color="D9D3B0" w:sz="4"/>
+              <w:left w:val="single" w:color="D9D3B0" w:sz="4"/>
+              <w:bottom w:val="single" w:color="D9D3B0" w:sz="4"/>
+              <w:right w:val="single" w:color="D9D3B0" w:sz="4"/>
+            </w:tcBorders>
+            <w:tcMar>
+              <w:top w:type="dxa" w:w="60"/>
+              <w:left w:type="dxa" w:w="100"/>
+              <w:bottom w:type="dxa" w:w="60"/>
+              <w:right w:type="dxa" w:w="100"/>
+            </w:tcMar>
+          </w:tcPr>
+          <w:p>
+            <w:pPr>
+              <w:jc w:val="left"/>
+            </w:pPr>
+            <w:r>
+              <w:rPr>
+                <w:color w:val="283618"/>
+                <w:sz w:val="19"/>
+                <w:szCs w:val="19"/>
+              </w:rPr>
+              <w:t xml:space="preserve">1</w:t>
+            </w:r>
+          </w:p>
+        </w:tc>
+        <w:tc>
+          <w:tcPr>
+            <w:tcW w:type="dxa" w:w="2206"/>
+            <w:tcBorders>
+              <w:top w:val="single" w:color="D9D3B0" w:sz="4"/>
+              <w:left w:val="single" w:color="D9D3B0" w:sz="4"/>
+              <w:bottom w:val="single" w:color="D9D3B0" w:sz="4"/>
+              <w:right w:val="single" w:color="D9D3B0" w:sz="4"/>
+            </w:tcBorders>
+            <w:tcMar>
+              <w:top w:type="dxa" w:w="60"/>
+              <w:left w:type="dxa" w:w="100"/>
+              <w:bottom w:type="dxa" w:w="60"/>
+              <w:right w:type="dxa" w:w="100"/>
+            </w:tcMar>
+          </w:tcPr>
+          <w:p>
+            <w:pPr>
+              <w:jc w:val="left"/>
+            </w:pPr>
+            <w:r>
+              <w:rPr>
+                <w:color w:val="283618"/>
+                <w:sz w:val="19"/>
+                <w:szCs w:val="19"/>
+              </w:rPr>
+              <w:t xml:space="preserve">Cliente</w:t>
+            </w:r>
+          </w:p>
+        </w:tc>
+        <w:tc>
+          <w:tcPr>
+            <w:tcW w:type="dxa" w:w="6018"/>
+            <w:tcBorders>
+              <w:top w:val="single" w:color="D9D3B0" w:sz="4"/>
+              <w:left w:val="single" w:color="D9D3B0" w:sz="4"/>
+              <w:bottom w:val="single" w:color="D9D3B0" w:sz="4"/>
+              <w:right w:val="single" w:color="D9D3B0" w:sz="4"/>
+            </w:tcBorders>
+            <w:tcMar>
+              <w:top w:type="dxa" w:w="60"/>
+              <w:left w:type="dxa" w:w="100"/>
+              <w:bottom w:type="dxa" w:w="60"/>
+              <w:right w:type="dxa" w:w="100"/>
+            </w:tcMar>
+          </w:tcPr>
+          <w:p>
+            <w:pPr>
+              <w:jc w:val="left"/>
+            </w:pPr>
+            <w:r>
+              <w:rPr>
+                <w:color w:val="283618"/>
+                <w:sz w:val="19"/>
+                <w:szCs w:val="19"/>
+              </w:rPr>
+              <w:t xml:space="preserve">Descreve a casa no simulador do site (planta, fotografias do quadro, equipamentos) e envia o pedido.</w:t>
+            </w:r>
+          </w:p>
+        </w:tc>
+      </w:tr>
+      <w:tr>
+        <w:tc>
+          <w:tcPr>
+            <w:tcW w:type="dxa" w:w="802"/>
+            <w:tcBorders>
+              <w:top w:val="single" w:color="D9D3B0" w:sz="4"/>
+              <w:left w:val="single" w:color="D9D3B0" w:sz="4"/>
+              <w:bottom w:val="single" w:color="D9D3B0" w:sz="4"/>
+              <w:right w:val="single" w:color="D9D3B0" w:sz="4"/>
+            </w:tcBorders>
+            <w:tcMar>
+              <w:top w:type="dxa" w:w="60"/>
+              <w:left w:type="dxa" w:w="100"/>
+              <w:bottom w:type="dxa" w:w="60"/>
+              <w:right w:type="dxa" w:w="100"/>
+            </w:tcMar>
+          </w:tcPr>
+          <w:p>
+            <w:pPr>
+              <w:jc w:val="left"/>
+            </w:pPr>
+            <w:r>
+              <w:rPr>
+                <w:color w:val="283618"/>
+                <w:sz w:val="19"/>
+                <w:szCs w:val="19"/>
+              </w:rPr>
+              <w:t xml:space="preserve">2</w:t>
+            </w:r>
+          </w:p>
+        </w:tc>
+        <w:tc>
+          <w:tcPr>
+            <w:tcW w:type="dxa" w:w="2206"/>
+            <w:tcBorders>
+              <w:top w:val="single" w:color="D9D3B0" w:sz="4"/>
+              <w:left w:val="single" w:color="D9D3B0" w:sz="4"/>
+              <w:bottom w:val="single" w:color="D9D3B0" w:sz="4"/>
+              <w:right w:val="single" w:color="D9D3B0" w:sz="4"/>
+            </w:tcBorders>
+            <w:tcMar>
+              <w:top w:type="dxa" w:w="60"/>
+              <w:left w:type="dxa" w:w="100"/>
+              <w:bottom w:type="dxa" w:w="60"/>
+              <w:right w:type="dxa" w:w="100"/>
+            </w:tcMar>
+          </w:tcPr>
+          <w:p>
+            <w:pPr>
+              <w:jc w:val="left"/>
+            </w:pPr>
+            <w:r>
+              <w:rPr>
+                <w:color w:val="283618"/>
+                <w:sz w:val="19"/>
+                <w:szCs w:val="19"/>
+              </w:rPr>
+              <w:t xml:space="preserve">CEO</w:t>
+            </w:r>
+          </w:p>
+        </w:tc>
+        <w:tc>
+          <w:tcPr>
+            <w:tcW w:type="dxa" w:w="6018"/>
+            <w:tcBorders>
+              <w:top w:val="single" w:color="D9D3B0" w:sz="4"/>
+              <w:left w:val="single" w:color="D9D3B0" w:sz="4"/>
+              <w:bottom w:val="single" w:color="D9D3B0" w:sz="4"/>
+              <w:right w:val="single" w:color="D9D3B0" w:sz="4"/>
+            </w:tcBorders>
+            <w:tcMar>
+              <w:top w:type="dxa" w:w="60"/>
+              <w:left w:type="dxa" w:w="100"/>
+              <w:bottom w:type="dxa" w:w="60"/>
+              <w:right w:type="dxa" w:w="100"/>
+            </w:tcMar>
+          </w:tcPr>
+          <w:p>
+            <w:pPr>
+              <w:jc w:val="left"/>
+            </w:pPr>
+            <w:r>
+              <w:rPr>
+                <w:color w:val="283618"/>
+                <w:sz w:val="19"/>
+                <w:szCs w:val="19"/>
+              </w:rPr>
+              <w:t xml:space="preserve">Valida o pedido com uma lista de verificação: planta completa, fotografia do quadro legível, morada dentro da área, contacto confirmado. Se faltar alguma coisa, devolve ao cliente para corrigir.</w:t>
+            </w:r>
+          </w:p>
+        </w:tc>
+      </w:tr>
+      <w:tr>
+        <w:tc>
+          <w:tcPr>
+            <w:tcW w:type="dxa" w:w="802"/>
+            <w:tcBorders>
+              <w:top w:val="single" w:color="D9D3B0" w:sz="4"/>
+              <w:left w:val="single" w:color="D9D3B0" w:sz="4"/>
+              <w:bottom w:val="single" w:color="D9D3B0" w:sz="4"/>
+              <w:right w:val="single" w:color="D9D3B0" w:sz="4"/>
+            </w:tcBorders>
+            <w:tcMar>
+              <w:top w:type="dxa" w:w="60"/>
+              <w:left w:type="dxa" w:w="100"/>
+              <w:bottom w:type="dxa" w:w="60"/>
+              <w:right w:type="dxa" w:w="100"/>
+            </w:tcMar>
+          </w:tcPr>
+          <w:p>
+            <w:pPr>
+              <w:jc w:val="left"/>
+            </w:pPr>
+            <w:r>
+              <w:rPr>
+                <w:color w:val="283618"/>
+                <w:sz w:val="19"/>
+                <w:szCs w:val="19"/>
+              </w:rPr>
+              <w:t xml:space="preserve">3</w:t>
+            </w:r>
+          </w:p>
+        </w:tc>
+        <w:tc>
+          <w:tcPr>
+            <w:tcW w:type="dxa" w:w="2206"/>
+            <w:tcBorders>
+              <w:top w:val="single" w:color="D9D3B0" w:sz="4"/>
+              <w:left w:val="single" w:color="D9D3B0" w:sz="4"/>
+              <w:bottom w:val="single" w:color="D9D3B0" w:sz="4"/>
+              <w:right w:val="single" w:color="D9D3B0" w:sz="4"/>
+            </w:tcBorders>
+            <w:tcMar>
+              <w:top w:type="dxa" w:w="60"/>
+              <w:left w:type="dxa" w:w="100"/>
+              <w:bottom w:type="dxa" w:w="60"/>
+              <w:right w:type="dxa" w:w="100"/>
+            </w:tcMar>
+          </w:tcPr>
+          <w:p>
+            <w:pPr>
+              <w:jc w:val="left"/>
+            </w:pPr>
+            <w:r>
+              <w:rPr>
+                <w:color w:val="283618"/>
+                <w:sz w:val="19"/>
+                <w:szCs w:val="19"/>
+              </w:rPr>
+              <w:t xml:space="preserve">Eletricistas parceiros da zona</w:t>
+            </w:r>
+          </w:p>
+        </w:tc>
+        <w:tc>
+          <w:tcPr>
+            <w:tcW w:type="dxa" w:w="6018"/>
+            <w:tcBorders>
+              <w:top w:val="single" w:color="D9D3B0" w:sz="4"/>
+              <w:left w:val="single" w:color="D9D3B0" w:sz="4"/>
+              <w:bottom w:val="single" w:color="D9D3B0" w:sz="4"/>
+              <w:right w:val="single" w:color="D9D3B0" w:sz="4"/>
+            </w:tcBorders>
+            <w:tcMar>
+              <w:top w:type="dxa" w:w="60"/>
+              <w:left w:type="dxa" w:w="100"/>
+              <w:bottom w:type="dxa" w:w="60"/>
+              <w:right w:type="dxa" w:w="100"/>
+            </w:tcMar>
+          </w:tcPr>
+          <w:p>
+            <w:pPr>
+              <w:jc w:val="left"/>
+            </w:pPr>
+            <w:r>
+              <w:rPr>
+                <w:color w:val="283618"/>
+                <w:sz w:val="19"/>
+                <w:szCs w:val="19"/>
+              </w:rPr>
+              <w:t xml:space="preserve">Veem o pedido na bolsa de trabalhos (planta, fotografias e relatório técnico, sem nome, morada nem telefone do cliente) e propõem horas e material.</w:t>
+            </w:r>
+          </w:p>
+        </w:tc>
+      </w:tr>
+      <w:tr>
+        <w:tc>
+          <w:tcPr>
+            <w:tcW w:type="dxa" w:w="802"/>
+            <w:tcBorders>
+              <w:top w:val="single" w:color="D9D3B0" w:sz="4"/>
+              <w:left w:val="single" w:color="D9D3B0" w:sz="4"/>
+              <w:bottom w:val="single" w:color="D9D3B0" w:sz="4"/>
+              <w:right w:val="single" w:color="D9D3B0" w:sz="4"/>
+            </w:tcBorders>
+            <w:tcMar>
+              <w:top w:type="dxa" w:w="60"/>
+              <w:left w:type="dxa" w:w="100"/>
+              <w:bottom w:type="dxa" w:w="60"/>
+              <w:right w:type="dxa" w:w="100"/>
+            </w:tcMar>
+          </w:tcPr>
+          <w:p>
+            <w:pPr>
+              <w:jc w:val="left"/>
+            </w:pPr>
+            <w:r>
+              <w:rPr>
+                <w:color w:val="283618"/>
+                <w:sz w:val="19"/>
+                <w:szCs w:val="19"/>
+              </w:rPr>
+              <w:t xml:space="preserve">4</w:t>
+            </w:r>
+          </w:p>
+        </w:tc>
+        <w:tc>
+          <w:tcPr>
+            <w:tcW w:type="dxa" w:w="2206"/>
+            <w:tcBorders>
+              <w:top w:val="single" w:color="D9D3B0" w:sz="4"/>
+              <w:left w:val="single" w:color="D9D3B0" w:sz="4"/>
+              <w:bottom w:val="single" w:color="D9D3B0" w:sz="4"/>
+              <w:right w:val="single" w:color="D9D3B0" w:sz="4"/>
+            </w:tcBorders>
+            <w:tcMar>
+              <w:top w:type="dxa" w:w="60"/>
+              <w:left w:type="dxa" w:w="100"/>
+              <w:bottom w:type="dxa" w:w="60"/>
+              <w:right w:type="dxa" w:w="100"/>
+            </w:tcMar>
+          </w:tcPr>
+          <w:p>
+            <w:pPr>
+              <w:jc w:val="left"/>
+            </w:pPr>
+            <w:r>
+              <w:rPr>
+                <w:color w:val="283618"/>
+                <w:sz w:val="19"/>
+                <w:szCs w:val="19"/>
+              </w:rPr>
+              <w:t xml:space="preserve">CEO</w:t>
+            </w:r>
+          </w:p>
+        </w:tc>
+        <w:tc>
+          <w:tcPr>
+            <w:tcW w:type="dxa" w:w="6018"/>
+            <w:tcBorders>
+              <w:top w:val="single" w:color="D9D3B0" w:sz="4"/>
+              <w:left w:val="single" w:color="D9D3B0" w:sz="4"/>
+              <w:bottom w:val="single" w:color="D9D3B0" w:sz="4"/>
+              <w:right w:val="single" w:color="D9D3B0" w:sz="4"/>
+            </w:tcBorders>
+            <w:tcMar>
+              <w:top w:type="dxa" w:w="60"/>
+              <w:left w:type="dxa" w:w="100"/>
+              <w:bottom w:type="dxa" w:w="60"/>
+              <w:right w:type="dxa" w:w="100"/>
+            </w:tcMar>
+          </w:tcPr>
+          <w:p>
+            <w:pPr>
+              <w:jc w:val="left"/>
+            </w:pPr>
+            <w:r>
+              <w:rPr>
+                <w:color w:val="283618"/>
+                <w:sz w:val="19"/>
+                <w:szCs w:val="19"/>
+              </w:rPr>
+              <w:t xml:space="preserve">Compara as propostas, escolhe o eletricista, define o preço e envia a proposta ao cliente.</w:t>
+            </w:r>
+          </w:p>
+        </w:tc>
+      </w:tr>
+      <w:tr>
+        <w:tc>
+          <w:tcPr>
+            <w:tcW w:type="dxa" w:w="802"/>
+            <w:tcBorders>
+              <w:top w:val="single" w:color="D9D3B0" w:sz="4"/>
+              <w:left w:val="single" w:color="D9D3B0" w:sz="4"/>
+              <w:bottom w:val="single" w:color="D9D3B0" w:sz="4"/>
+              <w:right w:val="single" w:color="D9D3B0" w:sz="4"/>
+            </w:tcBorders>
+            <w:tcMar>
+              <w:top w:type="dxa" w:w="60"/>
+              <w:left w:type="dxa" w:w="100"/>
+              <w:bottom w:type="dxa" w:w="60"/>
+              <w:right w:type="dxa" w:w="100"/>
+            </w:tcMar>
+          </w:tcPr>
+          <w:p>
+            <w:pPr>
+              <w:jc w:val="left"/>
+            </w:pPr>
+            <w:r>
+              <w:rPr>
+                <w:color w:val="283618"/>
+                <w:sz w:val="19"/>
+                <w:szCs w:val="19"/>
+              </w:rPr>
+              <w:t xml:space="preserve">5</w:t>
+            </w:r>
+          </w:p>
+        </w:tc>
+        <w:tc>
+          <w:tcPr>
+            <w:tcW w:type="dxa" w:w="2206"/>
+            <w:tcBorders>
+              <w:top w:val="single" w:color="D9D3B0" w:sz="4"/>
+              <w:left w:val="single" w:color="D9D3B0" w:sz="4"/>
+              <w:bottom w:val="single" w:color="D9D3B0" w:sz="4"/>
+              <w:right w:val="single" w:color="D9D3B0" w:sz="4"/>
+            </w:tcBorders>
+            <w:tcMar>
+              <w:top w:type="dxa" w:w="60"/>
+              <w:left w:type="dxa" w:w="100"/>
+              <w:bottom w:type="dxa" w:w="60"/>
+              <w:right w:type="dxa" w:w="100"/>
+            </w:tcMar>
+          </w:tcPr>
+          <w:p>
+            <w:pPr>
+              <w:jc w:val="left"/>
+            </w:pPr>
+            <w:r>
+              <w:rPr>
+                <w:color w:val="283618"/>
+                <w:sz w:val="19"/>
+                <w:szCs w:val="19"/>
+              </w:rPr>
+              <w:t xml:space="preserve">Cliente</w:t>
+            </w:r>
+          </w:p>
+        </w:tc>
+        <w:tc>
+          <w:tcPr>
+            <w:tcW w:type="dxa" w:w="6018"/>
+            <w:tcBorders>
+              <w:top w:val="single" w:color="D9D3B0" w:sz="4"/>
+              <w:left w:val="single" w:color="D9D3B0" w:sz="4"/>
+              <w:bottom w:val="single" w:color="D9D3B0" w:sz="4"/>
+              <w:right w:val="single" w:color="D9D3B0" w:sz="4"/>
+            </w:tcBorders>
+            <w:tcMar>
+              <w:top w:type="dxa" w:w="60"/>
+              <w:left w:type="dxa" w:w="100"/>
+              <w:bottom w:type="dxa" w:w="60"/>
+              <w:right w:type="dxa" w:w="100"/>
+            </w:tcMar>
+          </w:tcPr>
+          <w:p>
+            <w:pPr>
+              <w:jc w:val="left"/>
+            </w:pPr>
+            <w:r>
+              <w:rPr>
+                <w:color w:val="283618"/>
+                <w:sz w:val="19"/>
+                <w:szCs w:val="19"/>
+              </w:rPr>
+              <w:t xml:space="preserve">Aceita e paga o sinal de 30 %, que inclui a visita. Se não aceitar, diz porquê: o pedido volta ao CEO, que retifica e volta a pôr na bolsa, ou desiste.</w:t>
+            </w:r>
+          </w:p>
+        </w:tc>
+      </w:tr>
+      <w:tr>
+        <w:tc>
+          <w:tcPr>
+            <w:tcW w:type="dxa" w:w="802"/>
+            <w:tcBorders>
+              <w:top w:val="single" w:color="D9D3B0" w:sz="4"/>
+              <w:left w:val="single" w:color="D9D3B0" w:sz="4"/>
+              <w:bottom w:val="single" w:color="D9D3B0" w:sz="4"/>
+              <w:right w:val="single" w:color="D9D3B0" w:sz="4"/>
+            </w:tcBorders>
+            <w:tcMar>
+              <w:top w:type="dxa" w:w="60"/>
+              <w:left w:type="dxa" w:w="100"/>
+              <w:bottom w:type="dxa" w:w="60"/>
+              <w:right w:type="dxa" w:w="100"/>
+            </w:tcMar>
+          </w:tcPr>
+          <w:p>
+            <w:pPr>
+              <w:jc w:val="left"/>
+            </w:pPr>
+            <w:r>
+              <w:rPr>
+                <w:color w:val="283618"/>
+                <w:sz w:val="19"/>
+                <w:szCs w:val="19"/>
+              </w:rPr>
+              <w:t xml:space="preserve">6</w:t>
+            </w:r>
+          </w:p>
+        </w:tc>
+        <w:tc>
+          <w:tcPr>
+            <w:tcW w:type="dxa" w:w="2206"/>
+            <w:tcBorders>
+              <w:top w:val="single" w:color="D9D3B0" w:sz="4"/>
+              <w:left w:val="single" w:color="D9D3B0" w:sz="4"/>
+              <w:bottom w:val="single" w:color="D9D3B0" w:sz="4"/>
+              <w:right w:val="single" w:color="D9D3B0" w:sz="4"/>
+            </w:tcBorders>
+            <w:tcMar>
+              <w:top w:type="dxa" w:w="60"/>
+              <w:left w:type="dxa" w:w="100"/>
+              <w:bottom w:type="dxa" w:w="60"/>
+              <w:right w:type="dxa" w:w="100"/>
+            </w:tcMar>
+          </w:tcPr>
+          <w:p>
+            <w:pPr>
+              <w:jc w:val="left"/>
+            </w:pPr>
+            <w:r>
+              <w:rPr>
+                <w:color w:val="283618"/>
+                <w:sz w:val="19"/>
+                <w:szCs w:val="19"/>
+              </w:rPr>
+              <w:t xml:space="preserve">Eletricista escolhido</w:t>
+            </w:r>
+          </w:p>
+        </w:tc>
+        <w:tc>
+          <w:tcPr>
+            <w:tcW w:type="dxa" w:w="6018"/>
+            <w:tcBorders>
+              <w:top w:val="single" w:color="D9D3B0" w:sz="4"/>
+              <w:left w:val="single" w:color="D9D3B0" w:sz="4"/>
+              <w:bottom w:val="single" w:color="D9D3B0" w:sz="4"/>
+              <w:right w:val="single" w:color="D9D3B0" w:sz="4"/>
+            </w:tcBorders>
+            <w:tcMar>
+              <w:top w:type="dxa" w:w="60"/>
+              <w:left w:type="dxa" w:w="100"/>
+              <w:bottom w:type="dxa" w:w="60"/>
+              <w:right w:type="dxa" w:w="100"/>
+            </w:tcMar>
+          </w:tcPr>
+          <w:p>
+            <w:pPr>
+              <w:jc w:val="left"/>
+            </w:pPr>
+            <w:r>
+              <w:rPr>
+                <w:color w:val="283618"/>
+                <w:sz w:val="19"/>
+                <w:szCs w:val="19"/>
+              </w:rPr>
+              <w:t xml:space="preserve">Só agora recebe o contacto do cliente. Marca a visita em 48 horas e pode fazer a obra nessa visita. Regista as fotografias de antes e depois e os ensaios.</w:t>
+            </w:r>
+          </w:p>
+        </w:tc>
+      </w:tr>
+      <w:tr>
+        <w:tc>
+          <w:tcPr>
+            <w:tcW w:type="dxa" w:w="802"/>
+            <w:tcBorders>
+              <w:top w:val="single" w:color="D9D3B0" w:sz="4"/>
+              <w:left w:val="single" w:color="D9D3B0" w:sz="4"/>
+              <w:bottom w:val="single" w:color="D9D3B0" w:sz="4"/>
+              <w:right w:val="single" w:color="D9D3B0" w:sz="4"/>
+            </w:tcBorders>
+            <w:tcMar>
+              <w:top w:type="dxa" w:w="60"/>
+              <w:left w:type="dxa" w:w="100"/>
+              <w:bottom w:type="dxa" w:w="60"/>
+              <w:right w:type="dxa" w:w="100"/>
+            </w:tcMar>
+          </w:tcPr>
+          <w:p>
+            <w:pPr>
+              <w:jc w:val="left"/>
+            </w:pPr>
+            <w:r>
+              <w:rPr>
+                <w:color w:val="283618"/>
+                <w:sz w:val="19"/>
+                <w:szCs w:val="19"/>
+              </w:rPr>
+              <w:t xml:space="preserve">7</w:t>
+            </w:r>
+          </w:p>
+        </w:tc>
+        <w:tc>
+          <w:tcPr>
+            <w:tcW w:type="dxa" w:w="2206"/>
+            <w:tcBorders>
+              <w:top w:val="single" w:color="D9D3B0" w:sz="4"/>
+              <w:left w:val="single" w:color="D9D3B0" w:sz="4"/>
+              <w:bottom w:val="single" w:color="D9D3B0" w:sz="4"/>
+              <w:right w:val="single" w:color="D9D3B0" w:sz="4"/>
+            </w:tcBorders>
+            <w:tcMar>
+              <w:top w:type="dxa" w:w="60"/>
+              <w:left w:type="dxa" w:w="100"/>
+              <w:bottom w:type="dxa" w:w="60"/>
+              <w:right w:type="dxa" w:w="100"/>
+            </w:tcMar>
+          </w:tcPr>
+          <w:p>
+            <w:pPr>
+              <w:jc w:val="left"/>
+            </w:pPr>
+            <w:r>
+              <w:rPr>
+                <w:color w:val="283618"/>
+                <w:sz w:val="19"/>
+                <w:szCs w:val="19"/>
+              </w:rPr>
+              <w:t xml:space="preserve">Cliente</w:t>
+            </w:r>
+          </w:p>
+        </w:tc>
+        <w:tc>
+          <w:tcPr>
+            <w:tcW w:type="dxa" w:w="6018"/>
+            <w:tcBorders>
+              <w:top w:val="single" w:color="D9D3B0" w:sz="4"/>
+              <w:left w:val="single" w:color="D9D3B0" w:sz="4"/>
+              <w:bottom w:val="single" w:color="D9D3B0" w:sz="4"/>
+              <w:right w:val="single" w:color="D9D3B0" w:sz="4"/>
+            </w:tcBorders>
+            <w:tcMar>
+              <w:top w:type="dxa" w:w="60"/>
+              <w:left w:type="dxa" w:w="100"/>
+              <w:bottom w:type="dxa" w:w="60"/>
+              <w:right w:type="dxa" w:w="100"/>
+            </w:tcMar>
+          </w:tcPr>
+          <w:p>
+            <w:pPr>
+              <w:jc w:val="left"/>
+            </w:pPr>
+            <w:r>
+              <w:rPr>
+                <w:color w:val="283618"/>
+                <w:sz w:val="19"/>
+                <w:szCs w:val="19"/>
+              </w:rPr>
+              <w:t xml:space="preserve">Confirma que o trabalho ficou concluído, avalia de 1 a 5 estrelas e paga os 70 % restantes.</w:t>
+            </w:r>
+          </w:p>
+        </w:tc>
+      </w:tr>
+      <w:tr>
+        <w:tc>
+          <w:tcPr>
+            <w:tcW w:type="dxa" w:w="802"/>
+            <w:tcBorders>
+              <w:top w:val="single" w:color="D9D3B0" w:sz="4"/>
+              <w:left w:val="single" w:color="D9D3B0" w:sz="4"/>
+              <w:bottom w:val="single" w:color="D9D3B0" w:sz="4"/>
+              <w:right w:val="single" w:color="D9D3B0" w:sz="4"/>
+            </w:tcBorders>
+            <w:tcMar>
+              <w:top w:type="dxa" w:w="60"/>
+              <w:left w:type="dxa" w:w="100"/>
+              <w:bottom w:type="dxa" w:w="60"/>
+              <w:right w:type="dxa" w:w="100"/>
+            </w:tcMar>
+          </w:tcPr>
+          <w:p>
+            <w:pPr>
+              <w:jc w:val="left"/>
+            </w:pPr>
+            <w:r>
+              <w:rPr>
+                <w:color w:val="283618"/>
+                <w:sz w:val="19"/>
+                <w:szCs w:val="19"/>
+              </w:rPr>
+              <w:t xml:space="preserve">8</w:t>
+            </w:r>
+          </w:p>
+        </w:tc>
+        <w:tc>
+          <w:tcPr>
+            <w:tcW w:type="dxa" w:w="2206"/>
+            <w:tcBorders>
+              <w:top w:val="single" w:color="D9D3B0" w:sz="4"/>
+              <w:left w:val="single" w:color="D9D3B0" w:sz="4"/>
+              <w:bottom w:val="single" w:color="D9D3B0" w:sz="4"/>
+              <w:right w:val="single" w:color="D9D3B0" w:sz="4"/>
+            </w:tcBorders>
+            <w:tcMar>
+              <w:top w:type="dxa" w:w="60"/>
+              <w:left w:type="dxa" w:w="100"/>
+              <w:bottom w:type="dxa" w:w="60"/>
+              <w:right w:type="dxa" w:w="100"/>
+            </w:tcMar>
+          </w:tcPr>
+          <w:p>
+            <w:pPr>
+              <w:jc w:val="left"/>
+            </w:pPr>
+            <w:r>
+              <w:rPr>
+                <w:color w:val="283618"/>
+                <w:sz w:val="19"/>
+                <w:szCs w:val="19"/>
+              </w:rPr>
+              <w:t xml:space="preserve">CEO</w:t>
+            </w:r>
+          </w:p>
+        </w:tc>
+        <w:tc>
+          <w:tcPr>
+            <w:tcW w:type="dxa" w:w="6018"/>
+            <w:tcBorders>
+              <w:top w:val="single" w:color="D9D3B0" w:sz="4"/>
+              <w:left w:val="single" w:color="D9D3B0" w:sz="4"/>
+              <w:bottom w:val="single" w:color="D9D3B0" w:sz="4"/>
+              <w:right w:val="single" w:color="D9D3B0" w:sz="4"/>
+            </w:tcBorders>
+            <w:tcMar>
+              <w:top w:type="dxa" w:w="60"/>
+              <w:left w:type="dxa" w:w="100"/>
+              <w:bottom w:type="dxa" w:w="60"/>
+              <w:right w:type="dxa" w:w="100"/>
+            </w:tcMar>
+          </w:tcPr>
+          <w:p>
+            <w:pPr>
+              <w:jc w:val="left"/>
+            </w:pPr>
+            <w:r>
+              <w:rPr>
+                <w:color w:val="283618"/>
+                <w:sz w:val="19"/>
+                <w:szCs w:val="19"/>
+              </w:rPr>
+              <w:t xml:space="preserve">Aprova o trabalho e paga ao eletricista: 70 % da mão de obra (sem IVA) e a deslocação. O material é fornecido pela empresa.</w:t>
+            </w:r>
+          </w:p>
+        </w:tc>
+      </w:tr>
+    </w:tbl>
+    <w:p>
+      <w:pPr>
+        <w:spacing w:after="80"/>
+      </w:pPr>
+    </w:p>
+    <w:p>
+      <w:pPr>
+        <w:spacing w:after="120"/>
+      </w:pPr>
+      <w:r>
+        <w:t xml:space="preserve">O cliente trata sempre com a Domus Energia: o eletricista vai a casa dele em nome da empresa. O eletricista nunca escreve preços, só horas e material; é a empresa que calcula o preço.</w:t>
+      </w:r>
+    </w:p>
+    <w:p>
+      <w:pPr>
+        <w:spacing w:after="120"/>
+      </w:pPr>
+      <w:r>
+        <w:t xml:space="preserve">A qualidade é controlada em três pontos: a validação do CEO à entrada, as fotografias e os ensaios obrigatórios para concluir a obra, e a confirmação do cliente antes de se pagar ao eletricista.</w:t>
+      </w:r>
+    </w:p>
+    <w:p>
+      <w:pPr>
+        <w:pStyle w:val="Heading2"/>
+      </w:pPr>
+      <w:bookmarkStart w:name="_Toc18" w:id="18"/>
+      <w:r>
         <w:t xml:space="preserve">Fase de preparação (outubro de 2026 a agosto de 2027)</w:t>
       </w:r>
-      <w:bookmarkEnd w:id="17"/>
+      <w:bookmarkEnd w:id="18"/>
     </w:p>
     <w:p>
       <w:pPr>
@@ -7585,11 +8505,11 @@
       <w:pPr>
         <w:pStyle w:val="Heading1"/>
       </w:pPr>
-      <w:bookmarkStart w:name="_Toc18" w:id="18"/>
+      <w:bookmarkStart w:name="_Toc19" w:id="19"/>
       <w:r>
         <w:t xml:space="preserve">9. Recursos humanos e recursos da empresa</w:t>
       </w:r>
-      <w:bookmarkEnd w:id="18"/>
+      <w:bookmarkEnd w:id="19"/>
     </w:p>
     <w:p>
       <w:pPr>
@@ -8093,11 +9013,11 @@
       <w:pPr>
         <w:pStyle w:val="Heading2"/>
       </w:pPr>
-      <w:bookmarkStart w:name="_Toc19" w:id="19"/>
+      <w:bookmarkStart w:name="_Toc20" w:id="20"/>
       <w:r>
         <w:t xml:space="preserve">Organização proposta</w:t>
       </w:r>
-      <w:bookmarkEnd w:id="19"/>
+      <w:bookmarkEnd w:id="20"/>
     </w:p>
     <w:p>
       <w:pPr>
@@ -9121,11 +10041,11 @@
       <w:pPr>
         <w:pStyle w:val="Heading2"/>
       </w:pPr>
-      <w:bookmarkStart w:name="_Toc20" w:id="20"/>
+      <w:bookmarkStart w:name="_Toc21" w:id="21"/>
       <w:r>
         <w:t xml:space="preserve">Regras de funcionamento</w:t>
       </w:r>
-      <w:bookmarkEnd w:id="20"/>
+      <w:bookmarkEnd w:id="21"/>
     </w:p>
     <w:p>
       <w:pPr>
@@ -9209,11 +10129,11 @@
       <w:pPr>
         <w:pStyle w:val="Heading2"/>
       </w:pPr>
-      <w:bookmarkStart w:name="_Toc21" w:id="21"/>
+      <w:bookmarkStart w:name="_Toc22" w:id="22"/>
       <w:r>
         <w:t xml:space="preserve">Carga de trabalho prevista no ano 1</w:t>
       </w:r>
-      <w:bookmarkEnd w:id="21"/>
+      <w:bookmarkEnd w:id="22"/>
     </w:p>
     <w:tbl>
       <w:tblPr>
@@ -10013,11 +10933,11 @@
       <w:pPr>
         <w:pStyle w:val="Heading2"/>
       </w:pPr>
-      <w:bookmarkStart w:name="_Toc22" w:id="22"/>
+      <w:bookmarkStart w:name="_Toc23" w:id="23"/>
       <w:r>
         <w:t xml:space="preserve">De parceiro a contrato</w:t>
       </w:r>
-      <w:bookmarkEnd w:id="22"/>
+      <w:bookmarkEnd w:id="23"/>
     </w:p>
     <w:p>
       <w:pPr>
@@ -10031,11 +10951,11 @@
       <w:pPr>
         <w:pStyle w:val="Heading2"/>
       </w:pPr>
-      <w:bookmarkStart w:name="_Toc23" w:id="23"/>
+      <w:bookmarkStart w:name="_Toc24" w:id="24"/>
       <w:r>
         <w:t xml:space="preserve">Quando o gerente deixa de chegar</w:t>
       </w:r>
-      <w:bookmarkEnd w:id="23"/>
+      <w:bookmarkEnd w:id="24"/>
     </w:p>
     <w:p>
       <w:pPr>
@@ -10049,11 +10969,11 @@
       <w:pPr>
         <w:pStyle w:val="Heading1"/>
       </w:pPr>
-      <w:bookmarkStart w:name="_Toc24" w:id="24"/>
+      <w:bookmarkStart w:name="_Toc25" w:id="25"/>
       <w:r>
         <w:t xml:space="preserve">10. Investimento necessário</w:t>
       </w:r>
-      <w:bookmarkEnd w:id="24"/>
+      <w:bookmarkEnd w:id="25"/>
     </w:p>
     <w:p>
       <w:pPr>
@@ -10789,21 +11709,21 @@
       <w:pPr>
         <w:pStyle w:val="Heading1"/>
       </w:pPr>
-      <w:bookmarkStart w:name="_Toc25" w:id="25"/>
+      <w:bookmarkStart w:name="_Toc26" w:id="26"/>
       <w:r>
         <w:t xml:space="preserve">11. Custos e previsões financeiras</w:t>
       </w:r>
-      <w:bookmarkEnd w:id="25"/>
+      <w:bookmarkEnd w:id="26"/>
     </w:p>
     <w:p>
       <w:pPr>
         <w:pStyle w:val="Heading2"/>
       </w:pPr>
-      <w:bookmarkStart w:name="_Toc26" w:id="26"/>
+      <w:bookmarkStart w:name="_Toc27" w:id="27"/>
       <w:r>
         <w:t xml:space="preserve">Custo e despesa</w:t>
       </w:r>
-      <w:bookmarkEnd w:id="26"/>
+      <w:bookmarkEnd w:id="27"/>
     </w:p>
     <w:p>
       <w:pPr>
@@ -10817,11 +11737,11 @@
       <w:pPr>
         <w:pStyle w:val="Heading2"/>
       </w:pPr>
-      <w:bookmarkStart w:name="_Toc27" w:id="27"/>
+      <w:bookmarkStart w:name="_Toc28" w:id="28"/>
       <w:r>
         <w:t xml:space="preserve">Classificação dos custos da Domus Energia</w:t>
       </w:r>
-      <w:bookmarkEnd w:id="27"/>
+      <w:bookmarkEnd w:id="28"/>
     </w:p>
     <w:tbl>
       <w:tblPr>
@@ -11501,11 +12421,11 @@
       <w:pPr>
         <w:pStyle w:val="Heading2"/>
       </w:pPr>
-      <w:bookmarkStart w:name="_Toc28" w:id="28"/>
+      <w:bookmarkStart w:name="_Toc29" w:id="29"/>
       <w:r>
         <w:t xml:space="preserve">Custo estimado de uma obra (Casa inteligente (T3), 685 € sem IVA)</w:t>
       </w:r>
-      <w:bookmarkEnd w:id="28"/>
+      <w:bookmarkEnd w:id="29"/>
     </w:p>
     <w:tbl>
       <w:tblPr>
@@ -12111,11 +13031,11 @@
       <w:pPr>
         <w:pStyle w:val="Heading2"/>
       </w:pPr>
-      <w:bookmarkStart w:name="_Toc29" w:id="29"/>
+      <w:bookmarkStart w:name="_Toc30" w:id="30"/>
       <w:r>
         <w:t xml:space="preserve">Margem por tipo de obra</w:t>
       </w:r>
-      <w:bookmarkEnd w:id="29"/>
+      <w:bookmarkEnd w:id="30"/>
     </w:p>
     <w:tbl>
       <w:tblPr>
@@ -13471,11 +14391,11 @@
       <w:pPr>
         <w:pStyle w:val="Heading2"/>
       </w:pPr>
-      <w:bookmarkStart w:name="_Toc30" w:id="30"/>
+      <w:bookmarkStart w:name="_Toc31" w:id="31"/>
       <w:r>
         <w:t xml:space="preserve">Ponto de equilíbrio</w:t>
       </w:r>
-      <w:bookmarkEnd w:id="30"/>
+      <w:bookmarkEnd w:id="31"/>
     </w:p>
     <w:p>
       <w:pPr>
@@ -13489,11 +14409,11 @@
       <w:pPr>
         <w:pStyle w:val="Heading2"/>
       </w:pPr>
-      <w:bookmarkStart w:name="_Toc31" w:id="31"/>
+      <w:bookmarkStart w:name="_Toc32" w:id="32"/>
       <w:r>
         <w:t xml:space="preserve">Pressupostos</w:t>
       </w:r>
-      <w:bookmarkEnd w:id="31"/>
+      <w:bookmarkEnd w:id="32"/>
     </w:p>
     <w:p>
       <w:pPr>
@@ -13577,11 +14497,11 @@
       <w:pPr>
         <w:pStyle w:val="Heading2"/>
       </w:pPr>
-      <w:bookmarkStart w:name="_Toc32" w:id="32"/>
+      <w:bookmarkStart w:name="_Toc33" w:id="33"/>
       <w:r>
         <w:t xml:space="preserve">Custos fixos mensais</w:t>
       </w:r>
-      <w:bookmarkEnd w:id="32"/>
+      <w:bookmarkEnd w:id="33"/>
     </w:p>
     <w:tbl>
       <w:tblPr>
@@ -14239,11 +15159,11 @@
       <w:pPr>
         <w:pStyle w:val="Heading2"/>
       </w:pPr>
-      <w:bookmarkStart w:name="_Toc33" w:id="33"/>
+      <w:bookmarkStart w:name="_Toc34" w:id="34"/>
       <w:r>
         <w:t xml:space="preserve">Previsão mensal</w:t>
       </w:r>
-      <w:bookmarkEnd w:id="33"/>
+      <w:bookmarkEnd w:id="34"/>
     </w:p>
     <w:tbl>
       <w:tblPr>
@@ -17727,11 +18647,11 @@
       <w:pPr>
         <w:pStyle w:val="Heading1"/>
       </w:pPr>
-      <w:bookmarkStart w:name="_Toc34" w:id="34"/>
+      <w:bookmarkStart w:name="_Toc35" w:id="35"/>
       <w:r>
         <w:t xml:space="preserve">12. Riscos e medidas de prevenção</w:t>
       </w:r>
-      <w:bookmarkEnd w:id="34"/>
+      <w:bookmarkEnd w:id="35"/>
     </w:p>
     <w:tbl>
       <w:tblPr>
@@ -18779,11 +19699,11 @@
       <w:pPr>
         <w:pStyle w:val="Heading2"/>
       </w:pPr>
-      <w:bookmarkStart w:name="_Toc35" w:id="35"/>
+      <w:bookmarkStart w:name="_Toc36" w:id="36"/>
       <w:r>
         <w:t xml:space="preserve">Apoios a considerar</w:t>
       </w:r>
-      <w:bookmarkEnd w:id="35"/>
+      <w:bookmarkEnd w:id="36"/>
     </w:p>
     <w:p>
       <w:pPr>
@@ -18797,11 +19717,11 @@
       <w:pPr>
         <w:pStyle w:val="Heading1"/>
       </w:pPr>
-      <w:bookmarkStart w:name="_Toc36" w:id="36"/>
+      <w:bookmarkStart w:name="_Toc37" w:id="37"/>
       <w:r>
         <w:t xml:space="preserve">13. Objetivos e resultados esperados</w:t>
       </w:r>
-      <w:bookmarkEnd w:id="36"/>
+      <w:bookmarkEnd w:id="37"/>
     </w:p>
     <w:tbl>
       <w:tblPr>
@@ -19213,11 +20133,11 @@
       <w:pPr>
         <w:pStyle w:val="Heading1"/>
       </w:pPr>
-      <w:bookmarkStart w:name="_Toc37" w:id="37"/>
+      <w:bookmarkStart w:name="_Toc38" w:id="38"/>
       <w:r>
         <w:t xml:space="preserve">14. O plano como instrumento de decisão</w:t>
       </w:r>
-      <w:bookmarkEnd w:id="37"/>
+      <w:bookmarkEnd w:id="38"/>
     </w:p>
     <w:p>
       <w:pPr>
@@ -19925,11 +20845,11 @@
       <w:pPr>
         <w:pStyle w:val="Heading1"/>
       </w:pPr>
-      <w:bookmarkStart w:name="_Toc38" w:id="38"/>
+      <w:bookmarkStart w:name="_Toc39" w:id="39"/>
       <w:r>
         <w:t xml:space="preserve">15. Plano de ação</w:t>
       </w:r>
-      <w:bookmarkEnd w:id="38"/>
+      <w:bookmarkEnd w:id="39"/>
     </w:p>
     <w:p>
       <w:pPr>
@@ -19943,11 +20863,11 @@
       <w:pPr>
         <w:pStyle w:val="Heading2"/>
       </w:pPr>
-      <w:bookmarkStart w:name="_Toc39" w:id="39"/>
+      <w:bookmarkStart w:name="_Toc40" w:id="40"/>
       <w:r>
         <w:t xml:space="preserve">Preparação (outubro de 2026 a agosto de 2027)</w:t>
       </w:r>
-      <w:bookmarkEnd w:id="39"/>
+      <w:bookmarkEnd w:id="40"/>
     </w:p>
     <w:tbl>
       <w:tblPr>
@@ -21695,11 +22615,11 @@
       <w:pPr>
         <w:pStyle w:val="Heading2"/>
       </w:pPr>
-      <w:bookmarkStart w:name="_Toc40" w:id="40"/>
+      <w:bookmarkStart w:name="_Toc41" w:id="41"/>
       <w:r>
         <w:t xml:space="preserve">Arranque (setembro a novembro de 2027)</w:t>
       </w:r>
-      <w:bookmarkEnd w:id="40"/>
+      <w:bookmarkEnd w:id="41"/>
     </w:p>
     <w:tbl>
       <w:tblPr>
@@ -22839,11 +23759,11 @@
       <w:pPr>
         <w:pStyle w:val="Heading1"/>
       </w:pPr>
-      <w:bookmarkStart w:name="_Toc41" w:id="41"/>
+      <w:bookmarkStart w:name="_Toc42" w:id="42"/>
       <w:r>
         <w:t xml:space="preserve">III.1 Planeamento e organização do trabalho</w:t>
       </w:r>
-      <w:bookmarkEnd w:id="41"/>
+      <w:bookmarkEnd w:id="42"/>
     </w:p>
     <w:p>
       <w:pPr>
@@ -22857,11 +23777,11 @@
       <w:pPr>
         <w:pStyle w:val="Heading2"/>
       </w:pPr>
-      <w:bookmarkStart w:name="_Toc42" w:id="42"/>
+      <w:bookmarkStart w:name="_Toc43" w:id="43"/>
       <w:r>
         <w:t xml:space="preserve">Semana tipo do gerente</w:t>
       </w:r>
-      <w:bookmarkEnd w:id="42"/>
+      <w:bookmarkEnd w:id="43"/>
     </w:p>
     <w:tbl>
       <w:tblPr>
@@ -23449,11 +24369,11 @@
       <w:pPr>
         <w:pStyle w:val="Heading2"/>
       </w:pPr>
-      <w:bookmarkStart w:name="_Toc43" w:id="43"/>
+      <w:bookmarkStart w:name="_Toc44" w:id="44"/>
       <w:r>
         <w:t xml:space="preserve">Uma pessoa organizada, aplicado à empresa</w:t>
       </w:r>
-      <w:bookmarkEnd w:id="43"/>
+      <w:bookmarkEnd w:id="44"/>
     </w:p>
     <w:tbl>
       <w:tblPr>
@@ -23857,11 +24777,11 @@
       <w:pPr>
         <w:pStyle w:val="Heading2"/>
       </w:pPr>
-      <w:bookmarkStart w:name="_Toc44" w:id="44"/>
+      <w:bookmarkStart w:name="_Toc45" w:id="45"/>
       <w:r>
         <w:t xml:space="preserve">Ferramentas de organização</w:t>
       </w:r>
-      <w:bookmarkEnd w:id="44"/>
+      <w:bookmarkEnd w:id="45"/>
     </w:p>
     <w:p>
       <w:pPr>
@@ -23919,11 +24839,11 @@
       <w:pPr>
         <w:pStyle w:val="Heading1"/>
       </w:pPr>
-      <w:bookmarkStart w:name="_Toc45" w:id="45"/>
+      <w:bookmarkStart w:name="_Toc46" w:id="46"/>
       <w:r>
         <w:t xml:space="preserve">III.2 Gestão do tempo</w:t>
       </w:r>
-      <w:bookmarkEnd w:id="45"/>
+      <w:bookmarkEnd w:id="46"/>
     </w:p>
     <w:p>
       <w:pPr>
@@ -24273,11 +25193,11 @@
       <w:pPr>
         <w:pStyle w:val="Heading2"/>
       </w:pPr>
-      <w:bookmarkStart w:name="_Toc46" w:id="46"/>
+      <w:bookmarkStart w:name="_Toc47" w:id="47"/>
       <w:r>
         <w:t xml:space="preserve">Revisão semanal (sexta-feira, 20 minutos)</w:t>
       </w:r>
-      <w:bookmarkEnd w:id="46"/>
+      <w:bookmarkEnd w:id="47"/>
     </w:p>
     <w:p>
       <w:pPr>
@@ -24335,11 +25255,11 @@
       <w:pPr>
         <w:pStyle w:val="Heading1"/>
       </w:pPr>
-      <w:bookmarkStart w:name="_Toc47" w:id="47"/>
+      <w:bookmarkStart w:name="_Toc48" w:id="48"/>
       <w:r>
         <w:t xml:space="preserve">III.3 Definição de prioridades</w:t>
       </w:r>
-      <w:bookmarkEnd w:id="47"/>
+      <w:bookmarkEnd w:id="48"/>
     </w:p>
     <w:p>
       <w:pPr>
@@ -24659,11 +25579,11 @@
       <w:pPr>
         <w:pStyle w:val="Heading1"/>
       </w:pPr>
-      <w:bookmarkStart w:name="_Toc48" w:id="48"/>
+      <w:bookmarkStart w:name="_Toc49" w:id="49"/>
       <w:r>
         <w:t xml:space="preserve">III.4 Planeamento de tarefas</w:t>
       </w:r>
-      <w:bookmarkEnd w:id="48"/>
+      <w:bookmarkEnd w:id="49"/>
     </w:p>
     <w:p>
       <w:pPr>
@@ -25075,11 +25995,11 @@
       <w:pPr>
         <w:pStyle w:val="Heading2"/>
       </w:pPr>
-      <w:bookmarkStart w:name="_Toc49" w:id="49"/>
+      <w:bookmarkStart w:name="_Toc50" w:id="50"/>
       <w:r>
         <w:t xml:space="preserve">Funções do planeamento na empresa</w:t>
       </w:r>
-      <w:bookmarkEnd w:id="49"/>
+      <w:bookmarkEnd w:id="50"/>
     </w:p>
     <w:tbl>
       <w:tblPr>
@@ -25757,11 +26677,11 @@
       <w:pPr>
         <w:pStyle w:val="Heading2"/>
       </w:pPr>
-      <w:bookmarkStart w:name="_Toc50" w:id="50"/>
+      <w:bookmarkStart w:name="_Toc51" w:id="51"/>
       <w:r>
         <w:t xml:space="preserve">Exemplo do módulo: preparar a reunião semanal</w:t>
       </w:r>
-      <w:bookmarkEnd w:id="50"/>
+      <w:bookmarkEnd w:id="51"/>
     </w:p>
     <w:p>
       <w:pPr>
@@ -25884,11 +26804,11 @@
       <w:pPr>
         <w:pStyle w:val="Heading2"/>
       </w:pPr>
-      <w:bookmarkStart w:name="_Toc51" w:id="51"/>
+      <w:bookmarkStart w:name="_Toc52" w:id="52"/>
       <w:r>
         <w:t xml:space="preserve">Sequência de uma obra</w:t>
       </w:r>
-      <w:bookmarkEnd w:id="51"/>
+      <w:bookmarkEnd w:id="52"/>
     </w:p>
     <w:p>
       <w:pPr>
@@ -26024,11 +26944,11 @@
       <w:pPr>
         <w:pStyle w:val="Heading1"/>
       </w:pPr>
-      <w:bookmarkStart w:name="_Toc52" w:id="52"/>
+      <w:bookmarkStart w:name="_Toc53" w:id="53"/>
       <w:r>
         <w:t xml:space="preserve">III.5 Objetivos e resultados (SMART)</w:t>
       </w:r>
-      <w:bookmarkEnd w:id="52"/>
+      <w:bookmarkEnd w:id="53"/>
     </w:p>
     <w:p>
       <w:pPr>
@@ -27176,11 +28096,11 @@
       <w:pPr>
         <w:pStyle w:val="Heading2"/>
       </w:pPr>
-      <w:bookmarkStart w:name="_Toc53" w:id="53"/>
+      <w:bookmarkStart w:name="_Toc54" w:id="54"/>
       <w:r>
         <w:t xml:space="preserve">Exercício do módulo: de objetivo vago a SMART</w:t>
       </w:r>
-      <w:bookmarkEnd w:id="53"/>
+      <w:bookmarkEnd w:id="54"/>
     </w:p>
     <w:tbl>
       <w:tblPr>
@@ -27646,11 +28566,11 @@
       <w:pPr>
         <w:pStyle w:val="Heading1"/>
       </w:pPr>
-      <w:bookmarkStart w:name="_Toc54" w:id="54"/>
+      <w:bookmarkStart w:name="_Toc55" w:id="55"/>
       <w:r>
         <w:t xml:space="preserve">III.6 Trabalho e orientação para resultados</w:t>
       </w:r>
-      <w:bookmarkEnd w:id="54"/>
+      <w:bookmarkEnd w:id="55"/>
     </w:p>
     <w:p>
       <w:pPr>
@@ -28277,11 +29197,11 @@
       <w:pPr>
         <w:pStyle w:val="Heading1"/>
       </w:pPr>
-      <w:bookmarkStart w:name="_Toc55" w:id="55"/>
+      <w:bookmarkStart w:name="_Toc56" w:id="56"/>
       <w:r>
         <w:t xml:space="preserve">III.7 Proatividade</w:t>
       </w:r>
-      <w:bookmarkEnd w:id="55"/>
+      <w:bookmarkEnd w:id="56"/>
     </w:p>
     <w:p>
       <w:pPr>
@@ -29283,11 +30203,11 @@
       <w:pPr>
         <w:pStyle w:val="Heading1"/>
       </w:pPr>
-      <w:bookmarkStart w:name="_Toc56" w:id="56"/>
+      <w:bookmarkStart w:name="_Toc57" w:id="57"/>
       <w:r>
         <w:t xml:space="preserve">III.8 Capacidade de decisão</w:t>
       </w:r>
-      <w:bookmarkEnd w:id="56"/>
+      <w:bookmarkEnd w:id="57"/>
     </w:p>
     <w:p>
       <w:pPr>
@@ -30067,11 +30987,11 @@
       <w:pPr>
         <w:pStyle w:val="Heading2"/>
       </w:pPr>
-      <w:bookmarkStart w:name="_Toc57" w:id="57"/>
+      <w:bookmarkStart w:name="_Toc58" w:id="58"/>
       <w:r>
         <w:t xml:space="preserve">Da decisão à ação (passo 6) e avaliação (passo 7)</w:t>
       </w:r>
-      <w:bookmarkEnd w:id="57"/>
+      <w:bookmarkEnd w:id="58"/>
     </w:p>
     <w:p>
       <w:pPr>
@@ -30496,11 +31416,11 @@
       <w:pPr>
         <w:pStyle w:val="Heading1"/>
       </w:pPr>
-      <w:bookmarkStart w:name="_Toc58" w:id="58"/>
+      <w:bookmarkStart w:name="_Toc59" w:id="59"/>
       <w:r>
         <w:t xml:space="preserve">Próximos passos (próximos 90 dias)</w:t>
       </w:r>
-      <w:bookmarkEnd w:id="58"/>
+      <w:bookmarkEnd w:id="59"/>
     </w:p>
     <w:p>
       <w:pPr>
@@ -30571,11 +31491,11 @@
       <w:pPr>
         <w:pStyle w:val="Heading1"/>
       </w:pPr>
-      <w:bookmarkStart w:name="_Toc59" w:id="59"/>
+      <w:bookmarkStart w:name="_Toc60" w:id="60"/>
       <w:r>
         <w:t xml:space="preserve">Anexo A: Atividade de grupo, ideia de negócio</w:t>
       </w:r>
-      <w:bookmarkEnd w:id="59"/>
+      <w:bookmarkEnd w:id="60"/>
     </w:p>
     <w:tbl>
       <w:tblPr>
@@ -31623,11 +32543,11 @@
       <w:pPr>
         <w:pStyle w:val="Heading1"/>
       </w:pPr>
-      <w:bookmarkStart w:name="_Toc60" w:id="60"/>
+      <w:bookmarkStart w:name="_Toc61" w:id="61"/>
       <w:r>
         <w:t xml:space="preserve">Anexo B: Correspondência com o módulo 7855</w:t>
       </w:r>
-      <w:bookmarkEnd w:id="60"/>
+      <w:bookmarkEnd w:id="61"/>
     </w:p>
     <w:tbl>
       <w:tblPr>

</xml_diff>

<commit_message>
Domus Energia (negócio): textos do plano e da apresentação alinhados com o fluxo novo (propostas na bolsa, três pontos de controlo, gerente)
Co-Authored-By: Claude Opus 5.5 <noreply@anthropic.com>
</commit_message>
<xml_diff>
--- a/domus-energia/negocio/Plano_de_Negocio_Domus_Energia.docx
+++ b/domus-energia/negocio/Plano_de_Negocio_Domus_Energia.docx
@@ -7443,7 +7443,7 @@
         <w:spacing w:after="60"/>
       </w:pPr>
       <w:r>
-        <w:t xml:space="preserve">O cliente faz o orçamento no site ou liga. Resposta em menos de 24 horas.</w:t>
+        <w:t xml:space="preserve">O cliente faz o pedido no site ou liga. O gerente valida o pedido e responde em menos de 24 horas.</w:t>
       </w:r>
     </w:p>
     <w:p>
@@ -7456,7 +7456,7 @@
         <w:spacing w:after="60"/>
       </w:pPr>
       <w:r>
-        <w:t xml:space="preserve">Visita de confirmação pelo eletricista da especialidade, se a obra o pedir.</w:t>
+        <w:t xml:space="preserve">Os eletricistas parceiros da zona propõem horas e material pela planta e pelas fotografias. O gerente escolhe e envia a proposta ao cliente.</w:t>
       </w:r>
     </w:p>
     <w:p>
@@ -7469,7 +7469,7 @@
         <w:spacing w:after="60"/>
       </w:pPr>
       <w:r>
-        <w:t xml:space="preserve">O cliente aceita e paga 30 % de sinal. Marca-se a obra e encomenda-se o material.</w:t>
+        <w:t xml:space="preserve">O cliente aceita e paga 30 % de sinal, que inclui a visita. Marca-se a visita e encomenda-se o material.</w:t>
       </w:r>
     </w:p>
     <w:p>
@@ -7482,7 +7482,7 @@
         <w:spacing w:after="60"/>
       </w:pPr>
       <w:r>
-        <w:t xml:space="preserve">Obra, ensaios, fotografias e confirmação do cliente. Paga os 70 % restantes.</w:t>
+        <w:t xml:space="preserve">Visita, em que a obra pode ser feita logo. Ensaios, fotografias e confirmação do cliente. Paga os 70 % restantes.</w:t>
       </w:r>
     </w:p>
     <w:p>
@@ -7531,7 +7531,7 @@
         <w:spacing w:after="60"/>
       </w:pPr>
       <w:r>
-        <w:t xml:space="preserve">Distribuição das obras: cada pedido vai para a bolsa de trabalhos, primeiro para o eletricista da especialidade. Se não puder, passa ao suplente.</w:t>
+        <w:t xml:space="preserve">Distribuição das obras: o pedido validado vai para a bolsa de trabalhos. Os parceiros da zona propõem horas e material e o gerente escolhe, a pesar a especialidade, a disponibilidade e a avaliação dos clientes. Quem não é escolhido fica de reserva.</w:t>
       </w:r>
     </w:p>
     <w:p>
@@ -7557,7 +7557,7 @@
         <w:spacing w:after="60"/>
       </w:pPr>
       <w:r>
-        <w:t xml:space="preserve">Qualidade: nenhuma obra fecha sem fotografias, valores dos ensaios, confirmação do cliente e aprovação do gerente no painel.</w:t>
+        <w:t xml:space="preserve">Qualidade: três pontos de controlo. O gerente valida o pedido à entrada; nenhuma obra se conclui sem fotografias de antes e depois e valores dos ensaios; o eletricista só é pago depois de o cliente confirmar e de o gerente aprovar no painel.</w:t>
       </w:r>
     </w:p>
     <w:p>
@@ -7601,7 +7601,7 @@
         <w:spacing w:after="120"/>
       </w:pPr>
       <w:r>
-        <w:t xml:space="preserve">Cada pedido segue sempre os mesmos oito passos, do site até ao pagamento do eletricista. O CEO é o gerente da empresa.</w:t>
+        <w:t xml:space="preserve">Cada pedido segue sempre os mesmos oito passos, do site até ao pagamento do eletricista.</w:t>
       </w:r>
     </w:p>
     <w:tbl>
@@ -7874,7 +7874,7 @@
                 <w:sz w:val="19"/>
                 <w:szCs w:val="19"/>
               </w:rPr>
-              <w:t xml:space="preserve">CEO</w:t>
+              <w:t xml:space="preserve">Gerente (CEO)</w:t>
             </w:r>
           </w:p>
         </w:tc>
@@ -8058,7 +8058,7 @@
                 <w:sz w:val="19"/>
                 <w:szCs w:val="19"/>
               </w:rPr>
-              <w:t xml:space="preserve">CEO</w:t>
+              <w:t xml:space="preserve">Gerente</w:t>
             </w:r>
           </w:p>
         </w:tc>
@@ -8180,7 +8180,7 @@
                 <w:sz w:val="19"/>
                 <w:szCs w:val="19"/>
               </w:rPr>
-              <w:t xml:space="preserve">Aceita e paga o sinal de 30 %, que inclui a visita. Se não aceitar, diz porquê: o pedido volta ao CEO, que retifica e volta a pôr na bolsa, ou desiste.</w:t>
+              <w:t xml:space="preserve">Aceita e paga o sinal de 30 %, que inclui a visita. Se não aceitar, diz porquê: o pedido volta ao gerente, que retifica e volta a pôr na bolsa, ou desiste.</w:t>
             </w:r>
           </w:p>
         </w:tc>
@@ -8426,7 +8426,7 @@
                 <w:sz w:val="19"/>
                 <w:szCs w:val="19"/>
               </w:rPr>
-              <w:t xml:space="preserve">CEO</w:t>
+              <w:t xml:space="preserve">Gerente</w:t>
             </w:r>
           </w:p>
         </w:tc>
@@ -8480,7 +8480,7 @@
         <w:spacing w:after="120"/>
       </w:pPr>
       <w:r>
-        <w:t xml:space="preserve">A qualidade é controlada em três pontos: a validação do CEO à entrada, as fotografias e os ensaios obrigatórios para concluir a obra, e a confirmação do cliente antes de se pagar ao eletricista.</w:t>
+        <w:t xml:space="preserve">A qualidade é controlada em três pontos: a validação do gerente à entrada, as fotografias e os ensaios obrigatórios para concluir a obra, e a confirmação do cliente antes de se pagar ao eletricista.</w:t>
       </w:r>
     </w:p>
     <w:p>
@@ -9635,7 +9635,7 @@
                 <w:sz w:val="19"/>
                 <w:szCs w:val="19"/>
               </w:rPr>
-              <w:t xml:space="preserve">Quadros novos e ampliações. Responsável pela revisão técnica: vê as fotografias e os ensaios das obras dos colegas</w:t>
+              <w:t xml:space="preserve">Quadros novos e ampliações</w:t>
             </w:r>
           </w:p>
         </w:tc>
@@ -10001,7 +10001,7 @@
                 <w:sz w:val="19"/>
                 <w:szCs w:val="19"/>
               </w:rPr>
-              <w:t xml:space="preserve">Linhas dedicadas para carregadores e máquinas; segundo elemento nas obras de quadro. Revê as obras do parceiro 1</w:t>
+              <w:t xml:space="preserve">Linhas dedicadas para carregadores e máquinas; segundo elemento nas obras de quadro</w:t>
             </w:r>
           </w:p>
         </w:tc>
@@ -10070,7 +10070,7 @@
         <w:spacing w:after="60"/>
       </w:pPr>
       <w:r>
-        <w:t xml:space="preserve">Quem faz a obra não é quem a revê. O parceiro 1 revê as obras dos colegas; o parceiro 4 revê as do parceiro 1. O gerente dá a aprovação final.</w:t>
+        <w:t xml:space="preserve">A qualidade é controlada em três pontos: o gerente valida o pedido à entrada; a obra só se conclui com fotografias de antes e depois e ensaios; o cliente confirma antes de se pagar ao eletricista.</w:t>
       </w:r>
     </w:p>
     <w:p>
@@ -10109,7 +10109,7 @@
         <w:spacing w:after="60"/>
       </w:pPr>
       <w:r>
-        <w:t xml:space="preserve">Cada obra é avaliada (ensaios, fotografias, opinião do cliente). A classificação decide quem recebe primeiro os trabalhos seguintes.</w:t>
+        <w:t xml:space="preserve">Cada obra é avaliada (ensaios, fotografias, avaliação do cliente). A classificação pesa na escolha do gerente para os trabalhos seguintes.</w:t>
       </w:r>
     </w:p>
     <w:p>
@@ -19383,7 +19383,7 @@
                 <w:sz w:val="19"/>
                 <w:szCs w:val="19"/>
               </w:rPr>
-              <w:t xml:space="preserve">Ensaios, fotografias, revisão por outro eletricista, aprovação do gerente; seguro de responsabilidade civil</w:t>
+              <w:t xml:space="preserve">Validação do pedido à entrada, fotografias e ensaios obrigatórios, confirmação do cliente, aprovação do gerente; seguro de responsabilidade civil</w:t>
             </w:r>
           </w:p>
         </w:tc>
@@ -20631,7 +20631,7 @@
                 <w:sz w:val="19"/>
                 <w:szCs w:val="19"/>
               </w:rPr>
-              <w:t xml:space="preserve">Por registo: fotografias, ensaios, revisão e aprovação</w:t>
+              <w:t xml:space="preserve">Por registo: fotografias, ensaios, confirmação do cliente e aprovação do gerente</w:t>
             </w:r>
           </w:p>
         </w:tc>
@@ -26828,7 +26828,7 @@
         <w:spacing w:after="60"/>
       </w:pPr>
       <w:r>
-        <w:t xml:space="preserve">Pedido no site ou por telefone; orçamento do simulador; resposta em 24 horas.</w:t>
+        <w:t xml:space="preserve">Pedido no site ou por telefone; orçamento do simulador; o gerente valida o pedido e responde em 24 horas.</w:t>
       </w:r>
     </w:p>
     <w:p>
@@ -26841,7 +26841,7 @@
         <w:spacing w:after="60"/>
       </w:pPr>
       <w:r>
-        <w:t xml:space="preserve">Visita de confirmação, se for precisa; o cliente aceita e paga o sinal.</w:t>
+        <w:t xml:space="preserve">Os eletricistas parceiros da zona propõem horas e material pela planta e pelas fotografias; o gerente escolhe e envia a proposta ao cliente.</w:t>
       </w:r>
     </w:p>
     <w:p>
@@ -26854,7 +26854,7 @@
         <w:spacing w:after="60"/>
       </w:pPr>
       <w:r>
-        <w:t xml:space="preserve">O gerente encomenda o material e prepara os aparelhos na bancada.</w:t>
+        <w:t xml:space="preserve">O cliente aceita e paga o sinal, que inclui a visita; o gerente encomenda o material e prepara os aparelhos na bancada.</w:t>
       </w:r>
     </w:p>
     <w:p>
@@ -26867,7 +26867,7 @@
         <w:spacing w:after="60"/>
       </w:pPr>
       <w:r>
-        <w:t xml:space="preserve">No local: cortar a energia, verificar a ausência de tensão, instalar.</w:t>
+        <w:t xml:space="preserve">Visita do eletricista escolhido, em que a obra pode ser feita logo: cortar a energia, verificar a ausência de tensão, instalar.</w:t>
       </w:r>
     </w:p>
     <w:p>
@@ -26906,7 +26906,7 @@
         <w:spacing w:after="60"/>
       </w:pPr>
       <w:r>
-        <w:t xml:space="preserve">Fotografias e valores na área do eletricista; o cliente confirma; revisão por outro eletricista.</w:t>
+        <w:t xml:space="preserve">Fotografias de antes e depois e valores dos ensaios na área do eletricista; o cliente confirma que o trabalho ficou concluído.</w:t>
       </w:r>
     </w:p>
     <w:p>
@@ -26919,7 +26919,7 @@
         <w:spacing w:after="60"/>
       </w:pPr>
       <w:r>
-        <w:t xml:space="preserve">O gerente aprova; o cliente paga o resto; o parceiro recebe em 7 dias.</w:t>
+        <w:t xml:space="preserve">O cliente paga o resto; o gerente aprova; o parceiro recebe em 7 dias.</w:t>
       </w:r>
     </w:p>
     <w:p>
@@ -27844,7 +27844,7 @@
                 <w:sz w:val="19"/>
                 <w:szCs w:val="19"/>
               </w:rPr>
-              <w:t xml:space="preserve">Ensaios, revisão e acompanhamento</w:t>
+              <w:t xml:space="preserve">Ensaios, confirmação do cliente e acompanhamento</w:t>
             </w:r>
           </w:p>
         </w:tc>
@@ -28966,7 +28966,7 @@
                 <w:sz w:val="19"/>
                 <w:szCs w:val="19"/>
               </w:rPr>
-              <w:t xml:space="preserve">Ensaios, fotografias e revisão por outro eletricista</w:t>
+              <w:t xml:space="preserve">Ensaios e fotografias obrigatórios e confirmação do cliente</w:t>
             </w:r>
           </w:p>
         </w:tc>
@@ -29945,7 +29945,7 @@
                 <w:sz w:val="19"/>
                 <w:szCs w:val="19"/>
               </w:rPr>
-              <w:t xml:space="preserve">Antecipar: ver o quadro na visita, antes da obra</w:t>
+              <w:t xml:space="preserve">Antecipar: ver o quadro nas fotografias do pedido, antes da obra</w:t>
             </w:r>
           </w:p>
         </w:tc>

</xml_diff>